<commit_message>
update documento y entrega final
</commit_message>
<xml_diff>
--- a/docs/Practica2_ViankaCastro.docx
+++ b/docs/Practica2_ViankaCastro.docx
@@ -719,7 +719,7 @@
           </mc:Choice>
           <mc:Fallback>
             <w:pict>
-              <v:group w14:anchorId="6C1C5834" id="Group 4933" o:spid="_x0000_s1026" style="position:absolute;margin-left:16.45pt;margin-top:2.85pt;width:3.95pt;height:26.5pt;z-index:251658240" coordsize="50292,336245" o:gfxdata="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">
+              <v:group w14:anchorId="04DDAEFF" id="Group 4933" o:spid="_x0000_s1026" style="position:absolute;margin-left:16.45pt;margin-top:2.85pt;width:3.95pt;height:26.5pt;z-index:251658240" coordsize="50292,336245" o:gfxdata="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">
                 <v:shape id="Shape 5607" o:spid="_x0000_s1027" style="position:absolute;width:50292;height:50292;visibility:visible;mso-wrap-style:square;v-text-anchor:top" coordsize="50292,50292" o:gfxdata="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" path="m,l50292,r,50292l,50292,,e" fillcolor="black" stroked="f" strokeweight="0">
                   <v:stroke miterlimit="83231f" joinstyle="miter"/>
                   <v:path arrowok="t" textboxrect="0,0,50292,50292"/>
@@ -753,6 +753,7 @@
         <w:rPr>
           <w:lang w:val="es-GT"/>
         </w:rPr>
+        <w:lastRenderedPageBreak/>
         <w:t>Mostrar, como mínimo, el número aleatorio generado, la demanda simulada y el resultado de la operación de cada día.</w:t>
       </w:r>
     </w:p>
@@ -851,7 +852,7 @@
           </mc:Choice>
           <mc:Fallback>
             <w:pict>
-              <v:group w14:anchorId="3E033843" id="Group 4934" o:spid="_x0000_s1026" style="width:3.95pt;height:3.95pt;mso-position-horizontal-relative:char;mso-position-vertical-relative:line" coordsize="50292,50292" o:gfxdata="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">
+              <v:group w14:anchorId="4B3CEC6B" id="Group 4934" o:spid="_x0000_s1026" style="width:3.95pt;height:3.95pt;mso-position-horizontal-relative:char;mso-position-vertical-relative:line" coordsize="50292,50292" o:gfxdata="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">
                 <v:shape id="Shape 5611" o:spid="_x0000_s1027" style="position:absolute;width:50292;height:50292;visibility:visible;mso-wrap-style:square;v-text-anchor:top" coordsize="50292,50292" o:gfxdata="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" path="m,l50292,r,50292l,50292,,e" fillcolor="black" stroked="f" strokeweight="0">
                   <v:stroke miterlimit="83231f" joinstyle="miter"/>
                   <v:path arrowok="t" textboxrect="0,0,50292,50292"/>
@@ -963,7 +964,7 @@
           </mc:Choice>
           <mc:Fallback>
             <w:pict>
-              <v:group w14:anchorId="3EDA5C8B" id="Group 4935" o:spid="_x0000_s1026" style="width:3.95pt;height:3.95pt;mso-position-horizontal-relative:char;mso-position-vertical-relative:line" coordsize="50292,50292" o:gfxdata="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">
+              <v:group w14:anchorId="0F1A5859" id="Group 4935" o:spid="_x0000_s1026" style="width:3.95pt;height:3.95pt;mso-position-horizontal-relative:char;mso-position-vertical-relative:line" coordsize="50292,50292" o:gfxdata="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">
                 <v:shape id="Shape 5613" o:spid="_x0000_s1027" style="position:absolute;width:50292;height:50292;visibility:visible;mso-wrap-style:square;v-text-anchor:top" coordsize="50292,50292" o:gfxdata="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" path="m,l50292,r,50292l,50292,,e" fillcolor="black" stroked="f" strokeweight="0">
                   <v:stroke miterlimit="83231f" joinstyle="miter"/>
                   <v:path arrowok="t" textboxrect="0,0,50292,50292"/>
@@ -991,9 +992,8 @@
     </w:p>
     <w:tbl>
       <w:tblPr>
-        <w:tblStyle w:val="TableGrid0"/>
+        <w:tblStyle w:val="GridTable5Dark-Accent3"/>
         <w:tblpPr w:leftFromText="180" w:rightFromText="180" w:vertAnchor="text" w:tblpY="1"/>
-        <w:tblOverlap w:val="never"/>
         <w:tblW w:w="0" w:type="auto"/>
         <w:tblLook w:val="04A0" w:firstRow="1" w:lastRow="0" w:firstColumn="1" w:lastColumn="0" w:noHBand="0" w:noVBand="1"/>
       </w:tblPr>
@@ -1004,24 +1004,24 @@
         <w:gridCol w:w="1666"/>
       </w:tblGrid>
       <w:tr>
+        <w:trPr>
+          <w:cnfStyle w:val="100000000000" w:firstRow="1" w:lastRow="0" w:firstColumn="0" w:lastColumn="0" w:oddVBand="0" w:evenVBand="0" w:oddHBand="0" w:evenHBand="0" w:firstRowFirstColumn="0" w:firstRowLastColumn="0" w:lastRowFirstColumn="0" w:lastRowLastColumn="0"/>
+        </w:trPr>
         <w:tc>
           <w:tcPr>
+            <w:cnfStyle w:val="001000000000" w:firstRow="0" w:lastRow="0" w:firstColumn="1" w:lastColumn="0" w:oddVBand="0" w:evenVBand="0" w:oddHBand="0" w:evenHBand="0" w:firstRowFirstColumn="0" w:firstRowLastColumn="0" w:lastRowFirstColumn="0" w:lastRowLastColumn="0"/>
             <w:tcW w:w="1488" w:type="dxa"/>
           </w:tcPr>
           <w:p>
             <w:pPr>
               <w:rPr>
-                <w:b/>
-                <w:bCs/>
+                <w:b w:val="0"/>
+                <w:bCs w:val="0"/>
                 <w:lang w:val="es-GT"/>
               </w:rPr>
             </w:pPr>
             <w:proofErr w:type="spellStart"/>
             <w:r>
-              <w:rPr>
-                <w:b/>
-                <w:bCs/>
-              </w:rPr>
               <w:t>Demanda</w:t>
             </w:r>
             <w:proofErr w:type="spellEnd"/>
@@ -1033,18 +1033,15 @@
           </w:tcPr>
           <w:p>
             <w:pPr>
+              <w:cnfStyle w:val="100000000000" w:firstRow="1" w:lastRow="0" w:firstColumn="0" w:lastColumn="0" w:oddVBand="0" w:evenVBand="0" w:oddHBand="0" w:evenHBand="0" w:firstRowFirstColumn="0" w:firstRowLastColumn="0" w:lastRowFirstColumn="0" w:lastRowLastColumn="0"/>
               <w:rPr>
-                <w:b/>
-                <w:bCs/>
+                <w:b w:val="0"/>
+                <w:bCs w:val="0"/>
                 <w:lang w:val="es-GT"/>
               </w:rPr>
             </w:pPr>
             <w:proofErr w:type="spellStart"/>
             <w:r>
-              <w:rPr>
-                <w:b/>
-                <w:bCs/>
-              </w:rPr>
               <w:t>Probabilidad</w:t>
             </w:r>
             <w:proofErr w:type="spellEnd"/>
@@ -1056,18 +1053,15 @@
           </w:tcPr>
           <w:p>
             <w:pPr>
+              <w:cnfStyle w:val="100000000000" w:firstRow="1" w:lastRow="0" w:firstColumn="0" w:lastColumn="0" w:oddVBand="0" w:evenVBand="0" w:oddHBand="0" w:evenHBand="0" w:firstRowFirstColumn="0" w:firstRowLastColumn="0" w:lastRowFirstColumn="0" w:lastRowLastColumn="0"/>
               <w:rPr>
-                <w:b/>
-                <w:bCs/>
+                <w:b w:val="0"/>
+                <w:bCs w:val="0"/>
                 <w:lang w:val="es-GT"/>
               </w:rPr>
             </w:pPr>
             <w:proofErr w:type="spellStart"/>
             <w:r>
-              <w:rPr>
-                <w:b/>
-                <w:bCs/>
-              </w:rPr>
               <w:t>Acumulada</w:t>
             </w:r>
             <w:proofErr w:type="spellEnd"/>
@@ -1079,18 +1073,15 @@
           </w:tcPr>
           <w:p>
             <w:pPr>
+              <w:cnfStyle w:val="100000000000" w:firstRow="1" w:lastRow="0" w:firstColumn="0" w:lastColumn="0" w:oddVBand="0" w:evenVBand="0" w:oddHBand="0" w:evenHBand="0" w:firstRowFirstColumn="0" w:firstRowLastColumn="0" w:lastRowFirstColumn="0" w:lastRowLastColumn="0"/>
               <w:rPr>
-                <w:b/>
-                <w:bCs/>
+                <w:b w:val="0"/>
+                <w:bCs w:val="0"/>
                 <w:lang w:val="es-GT"/>
               </w:rPr>
             </w:pPr>
             <w:proofErr w:type="spellStart"/>
             <w:r>
-              <w:rPr>
-                <w:b/>
-                <w:bCs/>
-              </w:rPr>
               <w:t>Intervalo</w:t>
             </w:r>
             <w:proofErr w:type="spellEnd"/>
@@ -1098,8 +1089,12 @@
         </w:tc>
       </w:tr>
       <w:tr>
+        <w:trPr>
+          <w:cnfStyle w:val="000000100000" w:firstRow="0" w:lastRow="0" w:firstColumn="0" w:lastColumn="0" w:oddVBand="0" w:evenVBand="0" w:oddHBand="1" w:evenHBand="0" w:firstRowFirstColumn="0" w:firstRowLastColumn="0" w:lastRowFirstColumn="0" w:lastRowLastColumn="0"/>
+        </w:trPr>
         <w:tc>
           <w:tcPr>
+            <w:cnfStyle w:val="001000000000" w:firstRow="0" w:lastRow="0" w:firstColumn="1" w:lastColumn="0" w:oddVBand="0" w:evenVBand="0" w:oddHBand="0" w:evenHBand="0" w:firstRowFirstColumn="0" w:firstRowLastColumn="0" w:lastRowFirstColumn="0" w:lastRowLastColumn="0"/>
             <w:tcW w:w="1488" w:type="dxa"/>
           </w:tcPr>
           <w:p>
@@ -1119,6 +1114,7 @@
           </w:tcPr>
           <w:p>
             <w:pPr>
+              <w:cnfStyle w:val="000000100000" w:firstRow="0" w:lastRow="0" w:firstColumn="0" w:lastColumn="0" w:oddVBand="0" w:evenVBand="0" w:oddHBand="1" w:evenHBand="0" w:firstRowFirstColumn="0" w:firstRowLastColumn="0" w:lastRowFirstColumn="0" w:lastRowLastColumn="0"/>
               <w:rPr>
                 <w:lang w:val="es-GT"/>
               </w:rPr>
@@ -1134,6 +1130,7 @@
           </w:tcPr>
           <w:p>
             <w:pPr>
+              <w:cnfStyle w:val="000000100000" w:firstRow="0" w:lastRow="0" w:firstColumn="0" w:lastColumn="0" w:oddVBand="0" w:evenVBand="0" w:oddHBand="1" w:evenHBand="0" w:firstRowFirstColumn="0" w:firstRowLastColumn="0" w:lastRowFirstColumn="0" w:lastRowLastColumn="0"/>
               <w:rPr>
                 <w:lang w:val="es-GT"/>
               </w:rPr>
@@ -1149,6 +1146,7 @@
           </w:tcPr>
           <w:p>
             <w:pPr>
+              <w:cnfStyle w:val="000000100000" w:firstRow="0" w:lastRow="0" w:firstColumn="0" w:lastColumn="0" w:oddVBand="0" w:evenVBand="0" w:oddHBand="1" w:evenHBand="0" w:firstRowFirstColumn="0" w:firstRowLastColumn="0" w:lastRowFirstColumn="0" w:lastRowLastColumn="0"/>
               <w:rPr>
                 <w:lang w:val="es-GT"/>
               </w:rPr>
@@ -1162,6 +1160,7 @@
       <w:tr>
         <w:tc>
           <w:tcPr>
+            <w:cnfStyle w:val="001000000000" w:firstRow="0" w:lastRow="0" w:firstColumn="1" w:lastColumn="0" w:oddVBand="0" w:evenVBand="0" w:oddHBand="0" w:evenHBand="0" w:firstRowFirstColumn="0" w:firstRowLastColumn="0" w:lastRowFirstColumn="0" w:lastRowLastColumn="0"/>
             <w:tcW w:w="1488" w:type="dxa"/>
           </w:tcPr>
           <w:p>
@@ -1181,6 +1180,7 @@
           </w:tcPr>
           <w:p>
             <w:pPr>
+              <w:cnfStyle w:val="000000000000" w:firstRow="0" w:lastRow="0" w:firstColumn="0" w:lastColumn="0" w:oddVBand="0" w:evenVBand="0" w:oddHBand="0" w:evenHBand="0" w:firstRowFirstColumn="0" w:firstRowLastColumn="0" w:lastRowFirstColumn="0" w:lastRowLastColumn="0"/>
               <w:rPr>
                 <w:lang w:val="es-GT"/>
               </w:rPr>
@@ -1196,6 +1196,7 @@
           </w:tcPr>
           <w:p>
             <w:pPr>
+              <w:cnfStyle w:val="000000000000" w:firstRow="0" w:lastRow="0" w:firstColumn="0" w:lastColumn="0" w:oddVBand="0" w:evenVBand="0" w:oddHBand="0" w:evenHBand="0" w:firstRowFirstColumn="0" w:firstRowLastColumn="0" w:lastRowFirstColumn="0" w:lastRowLastColumn="0"/>
               <w:rPr>
                 <w:lang w:val="es-GT"/>
               </w:rPr>
@@ -1211,6 +1212,7 @@
           </w:tcPr>
           <w:p>
             <w:pPr>
+              <w:cnfStyle w:val="000000000000" w:firstRow="0" w:lastRow="0" w:firstColumn="0" w:lastColumn="0" w:oddVBand="0" w:evenVBand="0" w:oddHBand="0" w:evenHBand="0" w:firstRowFirstColumn="0" w:firstRowLastColumn="0" w:lastRowFirstColumn="0" w:lastRowLastColumn="0"/>
               <w:rPr>
                 <w:lang w:val="es-GT"/>
               </w:rPr>
@@ -1222,8 +1224,12 @@
         </w:tc>
       </w:tr>
       <w:tr>
+        <w:trPr>
+          <w:cnfStyle w:val="000000100000" w:firstRow="0" w:lastRow="0" w:firstColumn="0" w:lastColumn="0" w:oddVBand="0" w:evenVBand="0" w:oddHBand="1" w:evenHBand="0" w:firstRowFirstColumn="0" w:firstRowLastColumn="0" w:lastRowFirstColumn="0" w:lastRowLastColumn="0"/>
+        </w:trPr>
         <w:tc>
           <w:tcPr>
+            <w:cnfStyle w:val="001000000000" w:firstRow="0" w:lastRow="0" w:firstColumn="1" w:lastColumn="0" w:oddVBand="0" w:evenVBand="0" w:oddHBand="0" w:evenHBand="0" w:firstRowFirstColumn="0" w:firstRowLastColumn="0" w:lastRowFirstColumn="0" w:lastRowLastColumn="0"/>
             <w:tcW w:w="1488" w:type="dxa"/>
           </w:tcPr>
           <w:p>
@@ -1243,6 +1249,7 @@
           </w:tcPr>
           <w:p>
             <w:pPr>
+              <w:cnfStyle w:val="000000100000" w:firstRow="0" w:lastRow="0" w:firstColumn="0" w:lastColumn="0" w:oddVBand="0" w:evenVBand="0" w:oddHBand="1" w:evenHBand="0" w:firstRowFirstColumn="0" w:firstRowLastColumn="0" w:lastRowFirstColumn="0" w:lastRowLastColumn="0"/>
               <w:rPr>
                 <w:lang w:val="es-GT"/>
               </w:rPr>
@@ -1258,6 +1265,7 @@
           </w:tcPr>
           <w:p>
             <w:pPr>
+              <w:cnfStyle w:val="000000100000" w:firstRow="0" w:lastRow="0" w:firstColumn="0" w:lastColumn="0" w:oddVBand="0" w:evenVBand="0" w:oddHBand="1" w:evenHBand="0" w:firstRowFirstColumn="0" w:firstRowLastColumn="0" w:lastRowFirstColumn="0" w:lastRowLastColumn="0"/>
               <w:rPr>
                 <w:lang w:val="es-GT"/>
               </w:rPr>
@@ -1273,6 +1281,7 @@
           </w:tcPr>
           <w:p>
             <w:pPr>
+              <w:cnfStyle w:val="000000100000" w:firstRow="0" w:lastRow="0" w:firstColumn="0" w:lastColumn="0" w:oddVBand="0" w:evenVBand="0" w:oddHBand="1" w:evenHBand="0" w:firstRowFirstColumn="0" w:firstRowLastColumn="0" w:lastRowFirstColumn="0" w:lastRowLastColumn="0"/>
               <w:rPr>
                 <w:lang w:val="es-GT"/>
               </w:rPr>
@@ -1286,6 +1295,7 @@
       <w:tr>
         <w:tc>
           <w:tcPr>
+            <w:cnfStyle w:val="001000000000" w:firstRow="0" w:lastRow="0" w:firstColumn="1" w:lastColumn="0" w:oddVBand="0" w:evenVBand="0" w:oddHBand="0" w:evenHBand="0" w:firstRowFirstColumn="0" w:firstRowLastColumn="0" w:lastRowFirstColumn="0" w:lastRowLastColumn="0"/>
             <w:tcW w:w="1488" w:type="dxa"/>
           </w:tcPr>
           <w:p>
@@ -1305,6 +1315,7 @@
           </w:tcPr>
           <w:p>
             <w:pPr>
+              <w:cnfStyle w:val="000000000000" w:firstRow="0" w:lastRow="0" w:firstColumn="0" w:lastColumn="0" w:oddVBand="0" w:evenVBand="0" w:oddHBand="0" w:evenHBand="0" w:firstRowFirstColumn="0" w:firstRowLastColumn="0" w:lastRowFirstColumn="0" w:lastRowLastColumn="0"/>
               <w:rPr>
                 <w:lang w:val="es-GT"/>
               </w:rPr>
@@ -1320,6 +1331,7 @@
           </w:tcPr>
           <w:p>
             <w:pPr>
+              <w:cnfStyle w:val="000000000000" w:firstRow="0" w:lastRow="0" w:firstColumn="0" w:lastColumn="0" w:oddVBand="0" w:evenVBand="0" w:oddHBand="0" w:evenHBand="0" w:firstRowFirstColumn="0" w:firstRowLastColumn="0" w:lastRowFirstColumn="0" w:lastRowLastColumn="0"/>
               <w:rPr>
                 <w:lang w:val="es-GT"/>
               </w:rPr>
@@ -1335,6 +1347,7 @@
           </w:tcPr>
           <w:p>
             <w:pPr>
+              <w:cnfStyle w:val="000000000000" w:firstRow="0" w:lastRow="0" w:firstColumn="0" w:lastColumn="0" w:oddVBand="0" w:evenVBand="0" w:oddHBand="0" w:evenHBand="0" w:firstRowFirstColumn="0" w:firstRowLastColumn="0" w:lastRowFirstColumn="0" w:lastRowLastColumn="0"/>
               <w:rPr>
                 <w:lang w:val="es-GT"/>
               </w:rPr>
@@ -1346,8 +1359,12 @@
         </w:tc>
       </w:tr>
       <w:tr>
+        <w:trPr>
+          <w:cnfStyle w:val="000000100000" w:firstRow="0" w:lastRow="0" w:firstColumn="0" w:lastColumn="0" w:oddVBand="0" w:evenVBand="0" w:oddHBand="1" w:evenHBand="0" w:firstRowFirstColumn="0" w:firstRowLastColumn="0" w:lastRowFirstColumn="0" w:lastRowLastColumn="0"/>
+        </w:trPr>
         <w:tc>
           <w:tcPr>
+            <w:cnfStyle w:val="001000000000" w:firstRow="0" w:lastRow="0" w:firstColumn="1" w:lastColumn="0" w:oddVBand="0" w:evenVBand="0" w:oddHBand="0" w:evenHBand="0" w:firstRowFirstColumn="0" w:firstRowLastColumn="0" w:lastRowFirstColumn="0" w:lastRowLastColumn="0"/>
             <w:tcW w:w="1488" w:type="dxa"/>
           </w:tcPr>
           <w:p>
@@ -1367,6 +1384,7 @@
           </w:tcPr>
           <w:p>
             <w:pPr>
+              <w:cnfStyle w:val="000000100000" w:firstRow="0" w:lastRow="0" w:firstColumn="0" w:lastColumn="0" w:oddVBand="0" w:evenVBand="0" w:oddHBand="1" w:evenHBand="0" w:firstRowFirstColumn="0" w:firstRowLastColumn="0" w:lastRowFirstColumn="0" w:lastRowLastColumn="0"/>
               <w:rPr>
                 <w:lang w:val="es-GT"/>
               </w:rPr>
@@ -1382,6 +1400,7 @@
           </w:tcPr>
           <w:p>
             <w:pPr>
+              <w:cnfStyle w:val="000000100000" w:firstRow="0" w:lastRow="0" w:firstColumn="0" w:lastColumn="0" w:oddVBand="0" w:evenVBand="0" w:oddHBand="1" w:evenHBand="0" w:firstRowFirstColumn="0" w:firstRowLastColumn="0" w:lastRowFirstColumn="0" w:lastRowLastColumn="0"/>
               <w:rPr>
                 <w:lang w:val="es-GT"/>
               </w:rPr>
@@ -1397,6 +1416,7 @@
           </w:tcPr>
           <w:p>
             <w:pPr>
+              <w:cnfStyle w:val="000000100000" w:firstRow="0" w:lastRow="0" w:firstColumn="0" w:lastColumn="0" w:oddVBand="0" w:evenVBand="0" w:oddHBand="1" w:evenHBand="0" w:firstRowFirstColumn="0" w:firstRowLastColumn="0" w:lastRowFirstColumn="0" w:lastRowLastColumn="0"/>
               <w:rPr>
                 <w:lang w:val="es-GT"/>
               </w:rPr>
@@ -1410,6 +1430,7 @@
       <w:tr>
         <w:tc>
           <w:tcPr>
+            <w:cnfStyle w:val="001000000000" w:firstRow="0" w:lastRow="0" w:firstColumn="1" w:lastColumn="0" w:oddVBand="0" w:evenVBand="0" w:oddHBand="0" w:evenHBand="0" w:firstRowFirstColumn="0" w:firstRowLastColumn="0" w:lastRowFirstColumn="0" w:lastRowLastColumn="0"/>
             <w:tcW w:w="1488" w:type="dxa"/>
           </w:tcPr>
           <w:p>
@@ -1429,6 +1450,7 @@
           </w:tcPr>
           <w:p>
             <w:pPr>
+              <w:cnfStyle w:val="000000000000" w:firstRow="0" w:lastRow="0" w:firstColumn="0" w:lastColumn="0" w:oddVBand="0" w:evenVBand="0" w:oddHBand="0" w:evenHBand="0" w:firstRowFirstColumn="0" w:firstRowLastColumn="0" w:lastRowFirstColumn="0" w:lastRowLastColumn="0"/>
               <w:rPr>
                 <w:lang w:val="es-GT"/>
               </w:rPr>
@@ -1444,6 +1466,7 @@
           </w:tcPr>
           <w:p>
             <w:pPr>
+              <w:cnfStyle w:val="000000000000" w:firstRow="0" w:lastRow="0" w:firstColumn="0" w:lastColumn="0" w:oddVBand="0" w:evenVBand="0" w:oddHBand="0" w:evenHBand="0" w:firstRowFirstColumn="0" w:firstRowLastColumn="0" w:lastRowFirstColumn="0" w:lastRowLastColumn="0"/>
               <w:rPr>
                 <w:lang w:val="es-GT"/>
               </w:rPr>
@@ -1459,6 +1482,7 @@
           </w:tcPr>
           <w:p>
             <w:pPr>
+              <w:cnfStyle w:val="000000000000" w:firstRow="0" w:lastRow="0" w:firstColumn="0" w:lastColumn="0" w:oddVBand="0" w:evenVBand="0" w:oddHBand="0" w:evenHBand="0" w:firstRowFirstColumn="0" w:firstRowLastColumn="0" w:lastRowFirstColumn="0" w:lastRowLastColumn="0"/>
               <w:rPr>
                 <w:lang w:val="es-GT"/>
               </w:rPr>
@@ -1813,6 +1837,7 @@
           <w:noProof/>
           <w:lang w:val="es-GT"/>
         </w:rPr>
+        <w:lastRenderedPageBreak/>
         <w:drawing>
           <wp:inline distT="0" distB="0" distL="0" distR="0" wp14:anchorId="1A76E5DB" wp14:editId="5E5CD308">
             <wp:extent cx="3314870" cy="1606633"/>
@@ -1911,7 +1936,6 @@
           <w:noProof/>
           <w:lang w:val="es-GT"/>
         </w:rPr>
-        <w:lastRenderedPageBreak/>
         <w:drawing>
           <wp:inline distT="0" distB="0" distL="0" distR="0" wp14:anchorId="7123439F" wp14:editId="70E617B4">
             <wp:extent cx="2711589" cy="1600282"/>
@@ -2045,6 +2069,7 @@
         <w:rPr>
           <w:lang w:val="es-GT"/>
         </w:rPr>
+        <w:lastRenderedPageBreak/>
         <w:t>Ejercicio 2</w:t>
       </w:r>
     </w:p>
@@ -2347,7 +2372,7 @@
     </w:p>
     <w:tbl>
       <w:tblPr>
-        <w:tblStyle w:val="TableGrid0"/>
+        <w:tblStyle w:val="GridTable5Dark-Accent3"/>
         <w:tblW w:w="0" w:type="auto"/>
         <w:tblLook w:val="04A0" w:firstRow="1" w:lastRow="0" w:firstColumn="1" w:lastColumn="0" w:noHBand="0" w:noVBand="1"/>
       </w:tblPr>
@@ -2358,8 +2383,12 @@
         <w:gridCol w:w="2349"/>
       </w:tblGrid>
       <w:tr>
+        <w:trPr>
+          <w:cnfStyle w:val="100000000000" w:firstRow="1" w:lastRow="0" w:firstColumn="0" w:lastColumn="0" w:oddVBand="0" w:evenVBand="0" w:oddHBand="0" w:evenHBand="0" w:firstRowFirstColumn="0" w:firstRowLastColumn="0" w:lastRowFirstColumn="0" w:lastRowLastColumn="0"/>
+        </w:trPr>
         <w:tc>
           <w:tcPr>
+            <w:cnfStyle w:val="001000000000" w:firstRow="0" w:lastRow="0" w:firstColumn="1" w:lastColumn="0" w:oddVBand="0" w:evenVBand="0" w:oddHBand="0" w:evenHBand="0" w:firstRowFirstColumn="0" w:firstRowLastColumn="0" w:lastRowFirstColumn="0" w:lastRowLastColumn="0"/>
             <w:tcW w:w="2349" w:type="dxa"/>
           </w:tcPr>
           <w:p>
@@ -2372,16 +2401,12 @@
               </w:tabs>
               <w:spacing w:after="374" w:line="265" w:lineRule="auto"/>
               <w:rPr>
-                <w:b/>
-                <w:bCs/>
+                <w:b w:val="0"/>
+                <w:bCs w:val="0"/>
                 <w:lang w:val="es-GT"/>
               </w:rPr>
             </w:pPr>
             <w:r>
-              <w:rPr>
-                <w:b/>
-                <w:bCs/>
-              </w:rPr>
               <w:t>X</w:t>
             </w:r>
           </w:p>
@@ -2399,18 +2424,15 @@
                 <w:tab w:val="center" w:pos="7564"/>
               </w:tabs>
               <w:spacing w:after="374" w:line="265" w:lineRule="auto"/>
+              <w:cnfStyle w:val="100000000000" w:firstRow="1" w:lastRow="0" w:firstColumn="0" w:lastColumn="0" w:oddVBand="0" w:evenVBand="0" w:oddHBand="0" w:evenHBand="0" w:firstRowFirstColumn="0" w:firstRowLastColumn="0" w:lastRowFirstColumn="0" w:lastRowLastColumn="0"/>
               <w:rPr>
-                <w:b/>
-                <w:bCs/>
+                <w:b w:val="0"/>
+                <w:bCs w:val="0"/>
                 <w:lang w:val="es-GT"/>
               </w:rPr>
             </w:pPr>
             <w:proofErr w:type="spellStart"/>
             <w:r>
-              <w:rPr>
-                <w:b/>
-                <w:bCs/>
-              </w:rPr>
               <w:t>Probabilidad</w:t>
             </w:r>
             <w:proofErr w:type="spellEnd"/>
@@ -2429,18 +2451,15 @@
                 <w:tab w:val="center" w:pos="7564"/>
               </w:tabs>
               <w:spacing w:after="374" w:line="265" w:lineRule="auto"/>
+              <w:cnfStyle w:val="100000000000" w:firstRow="1" w:lastRow="0" w:firstColumn="0" w:lastColumn="0" w:oddVBand="0" w:evenVBand="0" w:oddHBand="0" w:evenHBand="0" w:firstRowFirstColumn="0" w:firstRowLastColumn="0" w:lastRowFirstColumn="0" w:lastRowLastColumn="0"/>
               <w:rPr>
-                <w:b/>
-                <w:bCs/>
+                <w:b w:val="0"/>
+                <w:bCs w:val="0"/>
                 <w:lang w:val="es-GT"/>
               </w:rPr>
             </w:pPr>
             <w:proofErr w:type="spellStart"/>
             <w:r>
-              <w:rPr>
-                <w:b/>
-                <w:bCs/>
-              </w:rPr>
               <w:t>Acumulada</w:t>
             </w:r>
             <w:proofErr w:type="spellEnd"/>
@@ -2459,18 +2478,15 @@
                 <w:tab w:val="center" w:pos="7564"/>
               </w:tabs>
               <w:spacing w:after="374" w:line="265" w:lineRule="auto"/>
+              <w:cnfStyle w:val="100000000000" w:firstRow="1" w:lastRow="0" w:firstColumn="0" w:lastColumn="0" w:oddVBand="0" w:evenVBand="0" w:oddHBand="0" w:evenHBand="0" w:firstRowFirstColumn="0" w:firstRowLastColumn="0" w:lastRowFirstColumn="0" w:lastRowLastColumn="0"/>
               <w:rPr>
-                <w:b/>
-                <w:bCs/>
+                <w:b w:val="0"/>
+                <w:bCs w:val="0"/>
                 <w:lang w:val="es-GT"/>
               </w:rPr>
             </w:pPr>
             <w:proofErr w:type="spellStart"/>
             <w:r>
-              <w:rPr>
-                <w:b/>
-                <w:bCs/>
-              </w:rPr>
               <w:t>Intervalo</w:t>
             </w:r>
             <w:proofErr w:type="spellEnd"/>
@@ -2478,8 +2494,12 @@
         </w:tc>
       </w:tr>
       <w:tr>
+        <w:trPr>
+          <w:cnfStyle w:val="000000100000" w:firstRow="0" w:lastRow="0" w:firstColumn="0" w:lastColumn="0" w:oddVBand="0" w:evenVBand="0" w:oddHBand="1" w:evenHBand="0" w:firstRowFirstColumn="0" w:firstRowLastColumn="0" w:lastRowFirstColumn="0" w:lastRowLastColumn="0"/>
+        </w:trPr>
         <w:tc>
           <w:tcPr>
+            <w:cnfStyle w:val="001000000000" w:firstRow="0" w:lastRow="0" w:firstColumn="1" w:lastColumn="0" w:oddVBand="0" w:evenVBand="0" w:oddHBand="0" w:evenHBand="0" w:firstRowFirstColumn="0" w:firstRowLastColumn="0" w:lastRowFirstColumn="0" w:lastRowLastColumn="0"/>
             <w:tcW w:w="2349" w:type="dxa"/>
           </w:tcPr>
           <w:p>
@@ -2513,6 +2533,7 @@
                 <w:tab w:val="center" w:pos="7564"/>
               </w:tabs>
               <w:spacing w:after="374" w:line="265" w:lineRule="auto"/>
+              <w:cnfStyle w:val="000000100000" w:firstRow="0" w:lastRow="0" w:firstColumn="0" w:lastColumn="0" w:oddVBand="0" w:evenVBand="0" w:oddHBand="1" w:evenHBand="0" w:firstRowFirstColumn="0" w:firstRowLastColumn="0" w:lastRowFirstColumn="0" w:lastRowLastColumn="0"/>
               <w:rPr>
                 <w:lang w:val="es-GT"/>
               </w:rPr>
@@ -2535,6 +2556,7 @@
                 <w:tab w:val="center" w:pos="7564"/>
               </w:tabs>
               <w:spacing w:after="374" w:line="265" w:lineRule="auto"/>
+              <w:cnfStyle w:val="000000100000" w:firstRow="0" w:lastRow="0" w:firstColumn="0" w:lastColumn="0" w:oddVBand="0" w:evenVBand="0" w:oddHBand="1" w:evenHBand="0" w:firstRowFirstColumn="0" w:firstRowLastColumn="0" w:lastRowFirstColumn="0" w:lastRowLastColumn="0"/>
               <w:rPr>
                 <w:lang w:val="es-GT"/>
               </w:rPr>
@@ -2557,6 +2579,7 @@
                 <w:tab w:val="center" w:pos="7564"/>
               </w:tabs>
               <w:spacing w:after="374" w:line="265" w:lineRule="auto"/>
+              <w:cnfStyle w:val="000000100000" w:firstRow="0" w:lastRow="0" w:firstColumn="0" w:lastColumn="0" w:oddVBand="0" w:evenVBand="0" w:oddHBand="1" w:evenHBand="0" w:firstRowFirstColumn="0" w:firstRowLastColumn="0" w:lastRowFirstColumn="0" w:lastRowLastColumn="0"/>
               <w:rPr>
                 <w:lang w:val="es-GT"/>
               </w:rPr>
@@ -2576,6 +2599,7 @@
       <w:tr>
         <w:tc>
           <w:tcPr>
+            <w:cnfStyle w:val="001000000000" w:firstRow="0" w:lastRow="0" w:firstColumn="1" w:lastColumn="0" w:oddVBand="0" w:evenVBand="0" w:oddHBand="0" w:evenHBand="0" w:firstRowFirstColumn="0" w:firstRowLastColumn="0" w:lastRowFirstColumn="0" w:lastRowLastColumn="0"/>
             <w:tcW w:w="2349" w:type="dxa"/>
           </w:tcPr>
           <w:p>
@@ -2609,6 +2633,7 @@
                 <w:tab w:val="center" w:pos="7564"/>
               </w:tabs>
               <w:spacing w:after="374" w:line="265" w:lineRule="auto"/>
+              <w:cnfStyle w:val="000000000000" w:firstRow="0" w:lastRow="0" w:firstColumn="0" w:lastColumn="0" w:oddVBand="0" w:evenVBand="0" w:oddHBand="0" w:evenHBand="0" w:firstRowFirstColumn="0" w:firstRowLastColumn="0" w:lastRowFirstColumn="0" w:lastRowLastColumn="0"/>
               <w:rPr>
                 <w:lang w:val="es-GT"/>
               </w:rPr>
@@ -2631,6 +2656,7 @@
                 <w:tab w:val="center" w:pos="7564"/>
               </w:tabs>
               <w:spacing w:after="374" w:line="265" w:lineRule="auto"/>
+              <w:cnfStyle w:val="000000000000" w:firstRow="0" w:lastRow="0" w:firstColumn="0" w:lastColumn="0" w:oddVBand="0" w:evenVBand="0" w:oddHBand="0" w:evenHBand="0" w:firstRowFirstColumn="0" w:firstRowLastColumn="0" w:lastRowFirstColumn="0" w:lastRowLastColumn="0"/>
               <w:rPr>
                 <w:lang w:val="es-GT"/>
               </w:rPr>
@@ -2653,6 +2679,7 @@
                 <w:tab w:val="center" w:pos="7564"/>
               </w:tabs>
               <w:spacing w:after="374" w:line="265" w:lineRule="auto"/>
+              <w:cnfStyle w:val="000000000000" w:firstRow="0" w:lastRow="0" w:firstColumn="0" w:lastColumn="0" w:oddVBand="0" w:evenVBand="0" w:oddHBand="0" w:evenHBand="0" w:firstRowFirstColumn="0" w:firstRowLastColumn="0" w:lastRowFirstColumn="0" w:lastRowLastColumn="0"/>
               <w:rPr>
                 <w:lang w:val="es-GT"/>
               </w:rPr>
@@ -2676,8 +2703,12 @@
         </w:tc>
       </w:tr>
       <w:tr>
+        <w:trPr>
+          <w:cnfStyle w:val="000000100000" w:firstRow="0" w:lastRow="0" w:firstColumn="0" w:lastColumn="0" w:oddVBand="0" w:evenVBand="0" w:oddHBand="1" w:evenHBand="0" w:firstRowFirstColumn="0" w:firstRowLastColumn="0" w:lastRowFirstColumn="0" w:lastRowLastColumn="0"/>
+        </w:trPr>
         <w:tc>
           <w:tcPr>
+            <w:cnfStyle w:val="001000000000" w:firstRow="0" w:lastRow="0" w:firstColumn="1" w:lastColumn="0" w:oddVBand="0" w:evenVBand="0" w:oddHBand="0" w:evenHBand="0" w:firstRowFirstColumn="0" w:firstRowLastColumn="0" w:lastRowFirstColumn="0" w:lastRowLastColumn="0"/>
             <w:tcW w:w="2349" w:type="dxa"/>
           </w:tcPr>
           <w:p>
@@ -2711,6 +2742,7 @@
                 <w:tab w:val="center" w:pos="7564"/>
               </w:tabs>
               <w:spacing w:after="374" w:line="265" w:lineRule="auto"/>
+              <w:cnfStyle w:val="000000100000" w:firstRow="0" w:lastRow="0" w:firstColumn="0" w:lastColumn="0" w:oddVBand="0" w:evenVBand="0" w:oddHBand="1" w:evenHBand="0" w:firstRowFirstColumn="0" w:firstRowLastColumn="0" w:lastRowFirstColumn="0" w:lastRowLastColumn="0"/>
               <w:rPr>
                 <w:lang w:val="es-GT"/>
               </w:rPr>
@@ -2733,6 +2765,7 @@
                 <w:tab w:val="center" w:pos="7564"/>
               </w:tabs>
               <w:spacing w:after="374" w:line="265" w:lineRule="auto"/>
+              <w:cnfStyle w:val="000000100000" w:firstRow="0" w:lastRow="0" w:firstColumn="0" w:lastColumn="0" w:oddVBand="0" w:evenVBand="0" w:oddHBand="1" w:evenHBand="0" w:firstRowFirstColumn="0" w:firstRowLastColumn="0" w:lastRowFirstColumn="0" w:lastRowLastColumn="0"/>
               <w:rPr>
                 <w:lang w:val="es-GT"/>
               </w:rPr>
@@ -2755,6 +2788,7 @@
                 <w:tab w:val="center" w:pos="7564"/>
               </w:tabs>
               <w:spacing w:after="374" w:line="265" w:lineRule="auto"/>
+              <w:cnfStyle w:val="000000100000" w:firstRow="0" w:lastRow="0" w:firstColumn="0" w:lastColumn="0" w:oddVBand="0" w:evenVBand="0" w:oddHBand="1" w:evenHBand="0" w:firstRowFirstColumn="0" w:firstRowLastColumn="0" w:lastRowFirstColumn="0" w:lastRowLastColumn="0"/>
               <w:rPr>
                 <w:lang w:val="es-GT"/>
               </w:rPr>
@@ -2774,6 +2808,7 @@
       <w:tr>
         <w:tc>
           <w:tcPr>
+            <w:cnfStyle w:val="001000000000" w:firstRow="0" w:lastRow="0" w:firstColumn="1" w:lastColumn="0" w:oddVBand="0" w:evenVBand="0" w:oddHBand="0" w:evenHBand="0" w:firstRowFirstColumn="0" w:firstRowLastColumn="0" w:lastRowFirstColumn="0" w:lastRowLastColumn="0"/>
             <w:tcW w:w="2349" w:type="dxa"/>
           </w:tcPr>
           <w:p>
@@ -2807,6 +2842,7 @@
                 <w:tab w:val="center" w:pos="7564"/>
               </w:tabs>
               <w:spacing w:after="374" w:line="265" w:lineRule="auto"/>
+              <w:cnfStyle w:val="000000000000" w:firstRow="0" w:lastRow="0" w:firstColumn="0" w:lastColumn="0" w:oddVBand="0" w:evenVBand="0" w:oddHBand="0" w:evenHBand="0" w:firstRowFirstColumn="0" w:firstRowLastColumn="0" w:lastRowFirstColumn="0" w:lastRowLastColumn="0"/>
               <w:rPr>
                 <w:lang w:val="es-GT"/>
               </w:rPr>
@@ -2829,6 +2865,7 @@
                 <w:tab w:val="center" w:pos="7564"/>
               </w:tabs>
               <w:spacing w:after="374" w:line="265" w:lineRule="auto"/>
+              <w:cnfStyle w:val="000000000000" w:firstRow="0" w:lastRow="0" w:firstColumn="0" w:lastColumn="0" w:oddVBand="0" w:evenVBand="0" w:oddHBand="0" w:evenHBand="0" w:firstRowFirstColumn="0" w:firstRowLastColumn="0" w:lastRowFirstColumn="0" w:lastRowLastColumn="0"/>
               <w:rPr>
                 <w:lang w:val="es-GT"/>
               </w:rPr>
@@ -2851,6 +2888,7 @@
                 <w:tab w:val="center" w:pos="7564"/>
               </w:tabs>
               <w:spacing w:after="374" w:line="265" w:lineRule="auto"/>
+              <w:cnfStyle w:val="000000000000" w:firstRow="0" w:lastRow="0" w:firstColumn="0" w:lastColumn="0" w:oddVBand="0" w:evenVBand="0" w:oddHBand="0" w:evenHBand="0" w:firstRowFirstColumn="0" w:firstRowLastColumn="0" w:lastRowFirstColumn="0" w:lastRowLastColumn="0"/>
               <w:rPr>
                 <w:lang w:val="es-GT"/>
               </w:rPr>
@@ -2899,7 +2937,6 @@
         <w:rPr>
           <w:lang w:val="es-GT"/>
         </w:rPr>
-        <w:lastRenderedPageBreak/>
         <w:t>Es casi el mismo principio que el ejercicio anterior ya que vamos colocando por medio de intervalos la probabilidad de que alguno ocurra</w:t>
       </w:r>
     </w:p>
@@ -2970,6 +3007,7 @@
         <w:rPr>
           <w:lang w:val="es-GT"/>
         </w:rPr>
+        <w:lastRenderedPageBreak/>
         <w:t>Ejercicio 3</w:t>
       </w:r>
     </w:p>
@@ -3147,7 +3185,6 @@
           <w:noProof/>
           <w:lang w:val="es-GT"/>
         </w:rPr>
-        <w:lastRenderedPageBreak/>
         <w:drawing>
           <wp:inline distT="0" distB="0" distL="0" distR="0" wp14:anchorId="19B8D22D" wp14:editId="0ADEF9A1">
             <wp:extent cx="5972810" cy="5820410"/>
@@ -3196,6 +3233,7 @@
         <w:rPr>
           <w:lang w:val="es-GT"/>
         </w:rPr>
+        <w:lastRenderedPageBreak/>
         <w:t xml:space="preserve">Si X = numero de aciertos </w:t>
       </w:r>
     </w:p>
@@ -3278,7 +3316,6 @@
         <w:rPr>
           <w:lang w:val="es-GT"/>
         </w:rPr>
-        <w:lastRenderedPageBreak/>
         <w:t xml:space="preserve">Varianza </w:t>
       </w:r>
     </w:p>
@@ -3575,6 +3612,7 @@
           <w:szCs w:val="28"/>
           <w:lang w:val="es-GT"/>
         </w:rPr>
+        <w:lastRenderedPageBreak/>
         <w:drawing>
           <wp:inline distT="0" distB="0" distL="0" distR="0" wp14:anchorId="0938C005" wp14:editId="612B26C7">
             <wp:extent cx="4750044" cy="1282766"/>
@@ -3717,7 +3755,6 @@
         <w:rPr>
           <w:lang w:val="es-GT"/>
         </w:rPr>
-        <w:lastRenderedPageBreak/>
         <w:t>Este problema es una variante del coleccionista de cupones, pero las once sumas no tienen la misma probabilidad. Las sumas centrales aparecen con mayor frecuencia y las sumas 2 y 12, con probabilidad 1/36 cada una, suelen determinar el tiempo de espera.</w:t>
       </w:r>
     </w:p>
@@ -3867,6 +3904,7 @@
         <w:rPr>
           <w:lang w:val="es-GT"/>
         </w:rPr>
+        <w:lastRenderedPageBreak/>
         <w:t>Ejercicio 6</w:t>
       </w:r>
     </w:p>
@@ -3987,7 +4025,33 @@
         <w:rPr>
           <w:lang w:val="es-GT"/>
         </w:rPr>
-        <w:t xml:space="preserve">Si un elemento k aparece mₖ veces, una posición elegida uniformemente lo selecciona con probabilidad </w:t>
+        <w:t>Si un elemento k aparece m</w:t>
+      </w:r>
+      <w:r>
+        <w:rPr>
+          <w:rFonts w:ascii="Cambria Math" w:hAnsi="Cambria Math" w:cs="Cambria Math"/>
+          <w:lang w:val="es-GT"/>
+        </w:rPr>
+        <w:t>ₖ</w:t>
+      </w:r>
+      <w:r>
+        <w:rPr>
+          <w:lang w:val="es-GT"/>
+        </w:rPr>
+        <w:t xml:space="preserve"> veces, una posici</w:t>
+      </w:r>
+      <w:r>
+        <w:rPr>
+          <w:rFonts w:ascii="Aptos" w:hAnsi="Aptos" w:cs="Aptos"/>
+          <w:lang w:val="es-GT"/>
+        </w:rPr>
+        <w:t>ó</w:t>
+      </w:r>
+      <w:r>
+        <w:rPr>
+          <w:lang w:val="es-GT"/>
+        </w:rPr>
+        <w:t xml:space="preserve">n elegida uniformemente lo selecciona con probabilidad </w:t>
       </w:r>
       <w:proofErr w:type="spellStart"/>
       <w:r>
@@ -4021,7 +4085,20 @@
         <w:rPr>
           <w:lang w:val="es-GT"/>
         </w:rPr>
-        <w:t>(k)/mₖ.</w:t>
+        <w:t>(k)/m</w:t>
+      </w:r>
+      <w:r>
+        <w:rPr>
+          <w:rFonts w:ascii="Cambria Math" w:hAnsi="Cambria Math" w:cs="Cambria Math"/>
+          <w:lang w:val="es-GT"/>
+        </w:rPr>
+        <w:t>ₖ</w:t>
+      </w:r>
+      <w:r>
+        <w:rPr>
+          <w:lang w:val="es-GT"/>
+        </w:rPr>
+        <w:t>.</w:t>
       </w:r>
     </w:p>
     <w:p>
@@ -4055,8 +4132,9 @@
           <w:sz w:val="24"/>
           <w:lang w:val="es-GT"/>
         </w:rPr>
-        <w:t>ₖ</w:t>
-      </w:r>
+        <w:t>ₖ (mₖ/</w:t>
+      </w:r>
+      <w:proofErr w:type="gramStart"/>
       <w:r>
         <w:rPr>
           <w:rFonts w:ascii="Cambria Math" w:hAnsi="Cambria Math"/>
@@ -4064,9 +4142,10 @@
           <w:sz w:val="24"/>
           <w:lang w:val="es-GT"/>
         </w:rPr>
-        <w:t xml:space="preserve"> (mₖ/</w:t>
-      </w:r>
-      <w:proofErr w:type="gramStart"/>
+        <w:t>n)(</w:t>
+      </w:r>
+      <w:proofErr w:type="spellStart"/>
+      <w:proofErr w:type="gramEnd"/>
       <w:r>
         <w:rPr>
           <w:rFonts w:ascii="Cambria Math" w:hAnsi="Cambria Math"/>
@@ -4074,10 +4153,9 @@
           <w:sz w:val="24"/>
           <w:lang w:val="es-GT"/>
         </w:rPr>
-        <w:t>n)(</w:t>
-      </w:r>
-      <w:proofErr w:type="spellStart"/>
-      <w:proofErr w:type="gramEnd"/>
+        <w:t>n·v</w:t>
+      </w:r>
+      <w:proofErr w:type="spellEnd"/>
       <w:r>
         <w:rPr>
           <w:rFonts w:ascii="Cambria Math" w:hAnsi="Cambria Math"/>
@@ -4085,43 +4163,24 @@
           <w:sz w:val="24"/>
           <w:lang w:val="es-GT"/>
         </w:rPr>
-        <w:t>n·v</w:t>
-      </w:r>
-      <w:proofErr w:type="spellEnd"/>
+        <w:t xml:space="preserve">(k)/mₖ) = </w:t>
+      </w:r>
       <w:r>
         <w:rPr>
           <w:rFonts w:ascii="Cambria Math" w:hAnsi="Cambria Math"/>
           <w:b/>
           <w:sz w:val="24"/>
-          <w:lang w:val="es-GT"/>
-        </w:rPr>
-        <w:t xml:space="preserve">(k)/mₖ) = </w:t>
+        </w:rPr>
+        <w:t>Σ</w:t>
       </w:r>
       <w:r>
         <w:rPr>
           <w:rFonts w:ascii="Cambria Math" w:hAnsi="Cambria Math"/>
           <w:b/>
           <w:sz w:val="24"/>
-        </w:rPr>
-        <w:t>Σ</w:t>
-      </w:r>
-      <w:r>
-        <w:rPr>
-          <w:rFonts w:ascii="Cambria Math" w:hAnsi="Cambria Math"/>
-          <w:b/>
-          <w:sz w:val="24"/>
-          <w:lang w:val="es-GT"/>
-        </w:rPr>
-        <w:t>ₖ</w:t>
-      </w:r>
-      <w:r>
-        <w:rPr>
-          <w:rFonts w:ascii="Cambria Math" w:hAnsi="Cambria Math"/>
-          <w:b/>
-          <w:sz w:val="24"/>
-          <w:lang w:val="es-GT"/>
-        </w:rPr>
-        <w:t xml:space="preserve"> v(k)</w:t>
+          <w:lang w:val="es-GT"/>
+        </w:rPr>
+        <w:t>ₖ v(k)</w:t>
       </w:r>
     </w:p>
     <w:p>
@@ -4208,13 +4267,7 @@
         <w:rPr>
           <w:lang w:val="es-GT"/>
         </w:rPr>
-        <w:t xml:space="preserve"> </w:t>
-      </w:r>
-      <w:r>
-        <w:rPr>
-          <w:lang w:val="es-GT"/>
-        </w:rPr>
-        <w:t xml:space="preserve">aunque los elementos del ejemplo aparecen con frecuencias diferentes, la corrección por </w:t>
+        <w:t xml:space="preserve"> aunque los elementos del ejemplo aparecen con frecuencias diferentes, la corrección por </w:t>
       </w:r>
       <w:proofErr w:type="spellStart"/>
       <w:r>
@@ -4249,7 +4302,6 @@
         <w:rPr>
           <w:lang w:val="es-GT"/>
         </w:rPr>
-        <w:lastRenderedPageBreak/>
         <w:t>Ejercicio 7</w:t>
       </w:r>
     </w:p>
@@ -4630,6 +4682,7 @@
           <w:b/>
           <w:lang w:val="es-GT"/>
         </w:rPr>
+        <w:lastRenderedPageBreak/>
         <w:t xml:space="preserve">PASO 5: </w:t>
       </w:r>
       <w:r>
@@ -4873,6 +4926,7 @@
     </w:p>
     <w:p>
       <w:pPr>
+        <w:spacing w:after="120"/>
         <w:rPr>
           <w:lang w:val="es-GT"/>
         </w:rPr>
@@ -4897,9 +4951,16 @@
       </w:r>
       <w:r>
         <w:rPr>
-          <w:lang w:val="es-GT"/>
-        </w:rPr>
-        <w:t>ₛ/</w:t>
+          <w:rFonts w:ascii="Cambria Math" w:hAnsi="Cambria Math" w:cs="Cambria Math"/>
+          <w:lang w:val="es-GT"/>
+        </w:rPr>
+        <w:t>ₛ</w:t>
+      </w:r>
+      <w:r>
+        <w:rPr>
+          <w:lang w:val="es-GT"/>
+        </w:rPr>
+        <w:t>/</w:t>
       </w:r>
       <w:r>
         <w:t>λ</w:t>
@@ -4915,9 +4976,16 @@
       </w:r>
       <w:r>
         <w:rPr>
-          <w:lang w:val="es-GT"/>
-        </w:rPr>
-        <w:t>ₙ y elimina candidatos hasta conservar exactamente la tasa deseada.</w:t>
+          <w:rFonts w:ascii="Cambria Math" w:hAnsi="Cambria Math" w:cs="Cambria Math"/>
+          <w:lang w:val="es-GT"/>
+        </w:rPr>
+        <w:t>ₙ</w:t>
+      </w:r>
+      <w:r>
+        <w:rPr>
+          <w:lang w:val="es-GT"/>
+        </w:rPr>
+        <w:t xml:space="preserve"> y elimina candidatos hasta conservar exactamente la tasa deseada.</w:t>
       </w:r>
     </w:p>
     <w:p>
@@ -5061,6 +5129,7 @@
       </w:r>
       <w:r>
         <w:rPr>
+          <w:rFonts w:ascii="Cambria Math" w:hAnsi="Cambria Math" w:cs="Cambria Math"/>
           <w:lang w:val="es-GT"/>
         </w:rPr>
         <w:t>ₙ</w:t>
@@ -5085,6 +5154,7 @@
       </w:r>
       <w:r>
         <w:rPr>
+          <w:rFonts w:ascii="Cambria Math" w:hAnsi="Cambria Math" w:cs="Cambria Math"/>
           <w:lang w:val="es-GT"/>
         </w:rPr>
         <w:t>ₙ</w:t>
@@ -5104,9 +5174,8 @@
     </w:p>
     <w:tbl>
       <w:tblPr>
-        <w:tblStyle w:val="TableGrid0"/>
+        <w:tblStyle w:val="ListTable4-Accent3"/>
         <w:tblW w:w="7776" w:type="dxa"/>
-        <w:tblInd w:w="120" w:type="dxa"/>
         <w:tblLayout w:type="fixed"/>
         <w:tblLook w:val="04A0" w:firstRow="1" w:lastRow="0" w:firstColumn="1" w:lastColumn="0" w:noHBand="0" w:noVBand="1"/>
       </w:tblPr>
@@ -5117,19 +5186,12 @@
       </w:tblGrid>
       <w:tr>
         <w:trPr>
-          <w:tblHeader/>
+          <w:cnfStyle w:val="100000000000" w:firstRow="1" w:lastRow="0" w:firstColumn="0" w:lastColumn="0" w:oddVBand="0" w:evenVBand="0" w:oddHBand="0" w:evenHBand="0" w:firstRowFirstColumn="0" w:firstRowLastColumn="0" w:lastRowFirstColumn="0" w:lastRowLastColumn="0"/>
         </w:trPr>
         <w:tc>
           <w:tcPr>
+            <w:cnfStyle w:val="001000000000" w:firstRow="0" w:lastRow="0" w:firstColumn="1" w:lastColumn="0" w:oddVBand="0" w:evenVBand="0" w:oddHBand="0" w:evenHBand="0" w:firstRowFirstColumn="0" w:firstRowLastColumn="0" w:lastRowFirstColumn="0" w:lastRowLastColumn="0"/>
             <w:tcW w:w="1152" w:type="dxa"/>
-            <w:shd w:val="clear" w:color="auto" w:fill="1F4E78"/>
-            <w:tcMar>
-              <w:top w:w="100" w:type="dxa"/>
-              <w:left w:w="100" w:type="dxa"/>
-              <w:bottom w:w="100" w:type="dxa"/>
-              <w:right w:w="100" w:type="dxa"/>
-            </w:tcMar>
-            <w:vAlign w:val="center"/>
           </w:tcPr>
           <w:p>
             <w:pPr>
@@ -5137,7 +5199,6 @@
             </w:pPr>
             <w:r>
               <w:rPr>
-                <w:b/>
                 <w:color w:val="FFFFFF"/>
                 <w:sz w:val="18"/>
               </w:rPr>
@@ -5148,23 +5209,15 @@
         <w:tc>
           <w:tcPr>
             <w:tcW w:w="3312" w:type="dxa"/>
-            <w:shd w:val="clear" w:color="auto" w:fill="1F4E78"/>
-            <w:tcMar>
-              <w:top w:w="100" w:type="dxa"/>
-              <w:left w:w="100" w:type="dxa"/>
-              <w:bottom w:w="100" w:type="dxa"/>
-              <w:right w:w="100" w:type="dxa"/>
-            </w:tcMar>
-            <w:vAlign w:val="center"/>
           </w:tcPr>
           <w:p>
             <w:pPr>
               <w:jc w:val="center"/>
+              <w:cnfStyle w:val="100000000000" w:firstRow="1" w:lastRow="0" w:firstColumn="0" w:lastColumn="0" w:oddVBand="0" w:evenVBand="0" w:oddHBand="0" w:evenHBand="0" w:firstRowFirstColumn="0" w:firstRowLastColumn="0" w:lastRowFirstColumn="0" w:lastRowLastColumn="0"/>
             </w:pPr>
             <w:proofErr w:type="spellStart"/>
             <w:r>
               <w:rPr>
-                <w:b/>
                 <w:color w:val="FFFFFF"/>
                 <w:sz w:val="18"/>
               </w:rPr>
@@ -5172,7 +5225,7 @@
             </w:r>
             <w:r>
               <w:rPr>
-                <w:b/>
+                <w:b w:val="0"/>
                 <w:color w:val="FFFFFF"/>
                 <w:sz w:val="18"/>
               </w:rPr>
@@ -5181,7 +5234,6 @@
             <w:proofErr w:type="spellEnd"/>
             <w:r>
               <w:rPr>
-                <w:b/>
                 <w:color w:val="FFFFFF"/>
                 <w:sz w:val="18"/>
               </w:rPr>
@@ -5190,7 +5242,6 @@
             <w:proofErr w:type="spellStart"/>
             <w:r>
               <w:rPr>
-                <w:b/>
                 <w:color w:val="FFFFFF"/>
                 <w:sz w:val="18"/>
               </w:rPr>
@@ -5202,14 +5253,30 @@
         <w:tc>
           <w:tcPr>
             <w:tcW w:w="3312" w:type="dxa"/>
-            <w:shd w:val="clear" w:color="auto" w:fill="1F4E78"/>
-            <w:tcMar>
-              <w:top w:w="100" w:type="dxa"/>
-              <w:left w:w="100" w:type="dxa"/>
-              <w:bottom w:w="100" w:type="dxa"/>
-              <w:right w:w="100" w:type="dxa"/>
-            </w:tcMar>
-            <w:vAlign w:val="center"/>
+          </w:tcPr>
+          <w:p>
+            <w:pPr>
+              <w:jc w:val="center"/>
+              <w:cnfStyle w:val="100000000000" w:firstRow="1" w:lastRow="0" w:firstColumn="0" w:lastColumn="0" w:oddVBand="0" w:evenVBand="0" w:oddHBand="0" w:evenHBand="0" w:firstRowFirstColumn="0" w:firstRowLastColumn="0" w:lastRowFirstColumn="0" w:lastRowLastColumn="0"/>
+            </w:pPr>
+            <w:r>
+              <w:rPr>
+                <w:color w:val="FFFFFF"/>
+                <w:sz w:val="18"/>
+              </w:rPr>
+              <w:t>Riesgo estimado</w:t>
+            </w:r>
+          </w:p>
+        </w:tc>
+      </w:tr>
+      <w:tr>
+        <w:trPr>
+          <w:cnfStyle w:val="000000100000" w:firstRow="0" w:lastRow="0" w:firstColumn="0" w:lastColumn="0" w:oddVBand="0" w:evenVBand="0" w:oddHBand="1" w:evenHBand="0" w:firstRowFirstColumn="0" w:firstRowLastColumn="0" w:lastRowFirstColumn="0" w:lastRowLastColumn="0"/>
+        </w:trPr>
+        <w:tc>
+          <w:tcPr>
+            <w:cnfStyle w:val="001000000000" w:firstRow="0" w:lastRow="0" w:firstColumn="1" w:lastColumn="0" w:oddVBand="0" w:evenVBand="0" w:oddHBand="0" w:evenHBand="0" w:firstRowFirstColumn="0" w:firstRowLastColumn="0" w:lastRowFirstColumn="0" w:lastRowLastColumn="0"/>
+            <w:tcW w:w="1152" w:type="dxa"/>
           </w:tcPr>
           <w:p>
             <w:pPr>
@@ -5217,11 +5284,43 @@
             </w:pPr>
             <w:r>
               <w:rPr>
-                <w:b/>
-                <w:color w:val="FFFFFF"/>
                 <w:sz w:val="18"/>
               </w:rPr>
-              <w:t>Riesgo estimado</w:t>
+              <w:t>1</w:t>
+            </w:r>
+          </w:p>
+        </w:tc>
+        <w:tc>
+          <w:tcPr>
+            <w:tcW w:w="3312" w:type="dxa"/>
+          </w:tcPr>
+          <w:p>
+            <w:pPr>
+              <w:jc w:val="center"/>
+              <w:cnfStyle w:val="000000100000" w:firstRow="0" w:lastRow="0" w:firstColumn="0" w:lastColumn="0" w:oddVBand="0" w:evenVBand="0" w:oddHBand="1" w:evenHBand="0" w:firstRowFirstColumn="0" w:firstRowLastColumn="0" w:lastRowFirstColumn="0" w:lastRowLastColumn="0"/>
+            </w:pPr>
+            <w:r>
+              <w:rPr>
+                <w:sz w:val="18"/>
+              </w:rPr>
+              <w:t>0.0650</w:t>
+            </w:r>
+          </w:p>
+        </w:tc>
+        <w:tc>
+          <w:tcPr>
+            <w:tcW w:w="3312" w:type="dxa"/>
+          </w:tcPr>
+          <w:p>
+            <w:pPr>
+              <w:jc w:val="center"/>
+              <w:cnfStyle w:val="000000100000" w:firstRow="0" w:lastRow="0" w:firstColumn="0" w:lastColumn="0" w:oddVBand="0" w:evenVBand="0" w:oddHBand="1" w:evenHBand="0" w:firstRowFirstColumn="0" w:firstRowLastColumn="0" w:lastRowFirstColumn="0" w:lastRowLastColumn="0"/>
+            </w:pPr>
+            <w:r>
+              <w:rPr>
+                <w:sz w:val="18"/>
+              </w:rPr>
+              <w:t>0.0650</w:t>
             </w:r>
           </w:p>
         </w:tc>
@@ -5229,14 +5328,8 @@
       <w:tr>
         <w:tc>
           <w:tcPr>
+            <w:cnfStyle w:val="001000000000" w:firstRow="0" w:lastRow="0" w:firstColumn="1" w:lastColumn="0" w:oddVBand="0" w:evenVBand="0" w:oddHBand="0" w:evenHBand="0" w:firstRowFirstColumn="0" w:firstRowLastColumn="0" w:lastRowFirstColumn="0" w:lastRowLastColumn="0"/>
             <w:tcW w:w="1152" w:type="dxa"/>
-            <w:tcMar>
-              <w:top w:w="100" w:type="dxa"/>
-              <w:left w:w="100" w:type="dxa"/>
-              <w:bottom w:w="100" w:type="dxa"/>
-              <w:right w:w="100" w:type="dxa"/>
-            </w:tcMar>
-            <w:vAlign w:val="center"/>
           </w:tcPr>
           <w:p>
             <w:pPr>
@@ -5246,20 +5339,53 @@
               <w:rPr>
                 <w:sz w:val="18"/>
               </w:rPr>
-              <w:t>1</w:t>
+              <w:t>2</w:t>
             </w:r>
           </w:p>
         </w:tc>
         <w:tc>
           <w:tcPr>
             <w:tcW w:w="3312" w:type="dxa"/>
-            <w:tcMar>
-              <w:top w:w="100" w:type="dxa"/>
-              <w:left w:w="100" w:type="dxa"/>
-              <w:bottom w:w="100" w:type="dxa"/>
-              <w:right w:w="100" w:type="dxa"/>
-            </w:tcMar>
-            <w:vAlign w:val="center"/>
+          </w:tcPr>
+          <w:p>
+            <w:pPr>
+              <w:jc w:val="center"/>
+              <w:cnfStyle w:val="000000000000" w:firstRow="0" w:lastRow="0" w:firstColumn="0" w:lastColumn="0" w:oddVBand="0" w:evenVBand="0" w:oddHBand="0" w:evenHBand="0" w:firstRowFirstColumn="0" w:firstRowLastColumn="0" w:lastRowFirstColumn="0" w:lastRowLastColumn="0"/>
+            </w:pPr>
+            <w:r>
+              <w:rPr>
+                <w:sz w:val="18"/>
+              </w:rPr>
+              <w:t>0.0800</w:t>
+            </w:r>
+          </w:p>
+        </w:tc>
+        <w:tc>
+          <w:tcPr>
+            <w:tcW w:w="3312" w:type="dxa"/>
+          </w:tcPr>
+          <w:p>
+            <w:pPr>
+              <w:jc w:val="center"/>
+              <w:cnfStyle w:val="000000000000" w:firstRow="0" w:lastRow="0" w:firstColumn="0" w:lastColumn="0" w:oddVBand="0" w:evenVBand="0" w:oddHBand="0" w:evenHBand="0" w:firstRowFirstColumn="0" w:firstRowLastColumn="0" w:lastRowFirstColumn="0" w:lastRowLastColumn="0"/>
+            </w:pPr>
+            <w:r>
+              <w:rPr>
+                <w:sz w:val="18"/>
+              </w:rPr>
+              <w:t>0.0798</w:t>
+            </w:r>
+          </w:p>
+        </w:tc>
+      </w:tr>
+      <w:tr>
+        <w:trPr>
+          <w:cnfStyle w:val="000000100000" w:firstRow="0" w:lastRow="0" w:firstColumn="0" w:lastColumn="0" w:oddVBand="0" w:evenVBand="0" w:oddHBand="1" w:evenHBand="0" w:firstRowFirstColumn="0" w:firstRowLastColumn="0" w:lastRowFirstColumn="0" w:lastRowLastColumn="0"/>
+        </w:trPr>
+        <w:tc>
+          <w:tcPr>
+            <w:cnfStyle w:val="001000000000" w:firstRow="0" w:lastRow="0" w:firstColumn="1" w:lastColumn="0" w:oddVBand="0" w:evenVBand="0" w:oddHBand="0" w:evenHBand="0" w:firstRowFirstColumn="0" w:firstRowLastColumn="0" w:lastRowFirstColumn="0" w:lastRowLastColumn="0"/>
+            <w:tcW w:w="1152" w:type="dxa"/>
           </w:tcPr>
           <w:p>
             <w:pPr>
@@ -5269,30 +5395,41 @@
               <w:rPr>
                 <w:sz w:val="18"/>
               </w:rPr>
-              <w:t>0.0650</w:t>
+              <w:t>3</w:t>
             </w:r>
           </w:p>
         </w:tc>
         <w:tc>
           <w:tcPr>
             <w:tcW w:w="3312" w:type="dxa"/>
-            <w:tcMar>
-              <w:top w:w="100" w:type="dxa"/>
-              <w:left w:w="100" w:type="dxa"/>
-              <w:bottom w:w="100" w:type="dxa"/>
-              <w:right w:w="100" w:type="dxa"/>
-            </w:tcMar>
-            <w:vAlign w:val="center"/>
           </w:tcPr>
           <w:p>
             <w:pPr>
               <w:jc w:val="center"/>
+              <w:cnfStyle w:val="000000100000" w:firstRow="0" w:lastRow="0" w:firstColumn="0" w:lastColumn="0" w:oddVBand="0" w:evenVBand="0" w:oddHBand="1" w:evenHBand="0" w:firstRowFirstColumn="0" w:firstRowLastColumn="0" w:lastRowFirstColumn="0" w:lastRowLastColumn="0"/>
             </w:pPr>
             <w:r>
               <w:rPr>
                 <w:sz w:val="18"/>
               </w:rPr>
-              <w:t>0.0650</w:t>
+              <w:t>0.0950</w:t>
+            </w:r>
+          </w:p>
+        </w:tc>
+        <w:tc>
+          <w:tcPr>
+            <w:tcW w:w="3312" w:type="dxa"/>
+          </w:tcPr>
+          <w:p>
+            <w:pPr>
+              <w:jc w:val="center"/>
+              <w:cnfStyle w:val="000000100000" w:firstRow="0" w:lastRow="0" w:firstColumn="0" w:lastColumn="0" w:oddVBand="0" w:evenVBand="0" w:oddHBand="1" w:evenHBand="0" w:firstRowFirstColumn="0" w:firstRowLastColumn="0" w:lastRowFirstColumn="0" w:lastRowLastColumn="0"/>
+            </w:pPr>
+            <w:r>
+              <w:rPr>
+                <w:sz w:val="18"/>
+              </w:rPr>
+              <w:t>0.0947</w:t>
             </w:r>
           </w:p>
         </w:tc>
@@ -5300,15 +5437,8 @@
       <w:tr>
         <w:tc>
           <w:tcPr>
+            <w:cnfStyle w:val="001000000000" w:firstRow="0" w:lastRow="0" w:firstColumn="1" w:lastColumn="0" w:oddVBand="0" w:evenVBand="0" w:oddHBand="0" w:evenHBand="0" w:firstRowFirstColumn="0" w:firstRowLastColumn="0" w:lastRowFirstColumn="0" w:lastRowLastColumn="0"/>
             <w:tcW w:w="1152" w:type="dxa"/>
-            <w:shd w:val="clear" w:color="auto" w:fill="D9EAF7"/>
-            <w:tcMar>
-              <w:top w:w="100" w:type="dxa"/>
-              <w:left w:w="100" w:type="dxa"/>
-              <w:bottom w:w="100" w:type="dxa"/>
-              <w:right w:w="100" w:type="dxa"/>
-            </w:tcMar>
-            <w:vAlign w:val="center"/>
           </w:tcPr>
           <w:p>
             <w:pPr>
@@ -5318,21 +5448,53 @@
               <w:rPr>
                 <w:sz w:val="18"/>
               </w:rPr>
-              <w:t>2</w:t>
+              <w:t>4</w:t>
             </w:r>
           </w:p>
         </w:tc>
         <w:tc>
           <w:tcPr>
             <w:tcW w:w="3312" w:type="dxa"/>
-            <w:shd w:val="clear" w:color="auto" w:fill="D9EAF7"/>
-            <w:tcMar>
-              <w:top w:w="100" w:type="dxa"/>
-              <w:left w:w="100" w:type="dxa"/>
-              <w:bottom w:w="100" w:type="dxa"/>
-              <w:right w:w="100" w:type="dxa"/>
-            </w:tcMar>
-            <w:vAlign w:val="center"/>
+          </w:tcPr>
+          <w:p>
+            <w:pPr>
+              <w:jc w:val="center"/>
+              <w:cnfStyle w:val="000000000000" w:firstRow="0" w:lastRow="0" w:firstColumn="0" w:lastColumn="0" w:oddVBand="0" w:evenVBand="0" w:oddHBand="0" w:evenHBand="0" w:firstRowFirstColumn="0" w:firstRowLastColumn="0" w:lastRowFirstColumn="0" w:lastRowLastColumn="0"/>
+            </w:pPr>
+            <w:r>
+              <w:rPr>
+                <w:sz w:val="18"/>
+              </w:rPr>
+              <w:t>0.1100</w:t>
+            </w:r>
+          </w:p>
+        </w:tc>
+        <w:tc>
+          <w:tcPr>
+            <w:tcW w:w="3312" w:type="dxa"/>
+          </w:tcPr>
+          <w:p>
+            <w:pPr>
+              <w:jc w:val="center"/>
+              <w:cnfStyle w:val="000000000000" w:firstRow="0" w:lastRow="0" w:firstColumn="0" w:lastColumn="0" w:oddVBand="0" w:evenVBand="0" w:oddHBand="0" w:evenHBand="0" w:firstRowFirstColumn="0" w:firstRowLastColumn="0" w:lastRowFirstColumn="0" w:lastRowLastColumn="0"/>
+            </w:pPr>
+            <w:r>
+              <w:rPr>
+                <w:sz w:val="18"/>
+              </w:rPr>
+              <w:t>0.1101</w:t>
+            </w:r>
+          </w:p>
+        </w:tc>
+      </w:tr>
+      <w:tr>
+        <w:trPr>
+          <w:cnfStyle w:val="000000100000" w:firstRow="0" w:lastRow="0" w:firstColumn="0" w:lastColumn="0" w:oddVBand="0" w:evenVBand="0" w:oddHBand="1" w:evenHBand="0" w:firstRowFirstColumn="0" w:firstRowLastColumn="0" w:lastRowFirstColumn="0" w:lastRowLastColumn="0"/>
+        </w:trPr>
+        <w:tc>
+          <w:tcPr>
+            <w:cnfStyle w:val="001000000000" w:firstRow="0" w:lastRow="0" w:firstColumn="1" w:lastColumn="0" w:oddVBand="0" w:evenVBand="0" w:oddHBand="0" w:evenHBand="0" w:firstRowFirstColumn="0" w:firstRowLastColumn="0" w:lastRowFirstColumn="0" w:lastRowLastColumn="0"/>
+            <w:tcW w:w="1152" w:type="dxa"/>
           </w:tcPr>
           <w:p>
             <w:pPr>
@@ -5342,31 +5504,41 @@
               <w:rPr>
                 <w:sz w:val="18"/>
               </w:rPr>
-              <w:t>0.0800</w:t>
+              <w:t>5</w:t>
             </w:r>
           </w:p>
         </w:tc>
         <w:tc>
           <w:tcPr>
             <w:tcW w:w="3312" w:type="dxa"/>
-            <w:shd w:val="clear" w:color="auto" w:fill="D9EAF7"/>
-            <w:tcMar>
-              <w:top w:w="100" w:type="dxa"/>
-              <w:left w:w="100" w:type="dxa"/>
-              <w:bottom w:w="100" w:type="dxa"/>
-              <w:right w:w="100" w:type="dxa"/>
-            </w:tcMar>
-            <w:vAlign w:val="center"/>
           </w:tcPr>
           <w:p>
             <w:pPr>
               <w:jc w:val="center"/>
+              <w:cnfStyle w:val="000000100000" w:firstRow="0" w:lastRow="0" w:firstColumn="0" w:lastColumn="0" w:oddVBand="0" w:evenVBand="0" w:oddHBand="1" w:evenHBand="0" w:firstRowFirstColumn="0" w:firstRowLastColumn="0" w:lastRowFirstColumn="0" w:lastRowLastColumn="0"/>
             </w:pPr>
             <w:r>
               <w:rPr>
                 <w:sz w:val="18"/>
               </w:rPr>
-              <w:t>0.0798</w:t>
+              <w:t>0.1250</w:t>
+            </w:r>
+          </w:p>
+        </w:tc>
+        <w:tc>
+          <w:tcPr>
+            <w:tcW w:w="3312" w:type="dxa"/>
+          </w:tcPr>
+          <w:p>
+            <w:pPr>
+              <w:jc w:val="center"/>
+              <w:cnfStyle w:val="000000100000" w:firstRow="0" w:lastRow="0" w:firstColumn="0" w:lastColumn="0" w:oddVBand="0" w:evenVBand="0" w:oddHBand="1" w:evenHBand="0" w:firstRowFirstColumn="0" w:firstRowLastColumn="0" w:lastRowFirstColumn="0" w:lastRowLastColumn="0"/>
+            </w:pPr>
+            <w:r>
+              <w:rPr>
+                <w:sz w:val="18"/>
+              </w:rPr>
+              <w:t>0.1220</w:t>
             </w:r>
           </w:p>
         </w:tc>
@@ -5374,14 +5546,8 @@
       <w:tr>
         <w:tc>
           <w:tcPr>
+            <w:cnfStyle w:val="001000000000" w:firstRow="0" w:lastRow="0" w:firstColumn="1" w:lastColumn="0" w:oddVBand="0" w:evenVBand="0" w:oddHBand="0" w:evenHBand="0" w:firstRowFirstColumn="0" w:firstRowLastColumn="0" w:lastRowFirstColumn="0" w:lastRowLastColumn="0"/>
             <w:tcW w:w="1152" w:type="dxa"/>
-            <w:tcMar>
-              <w:top w:w="100" w:type="dxa"/>
-              <w:left w:w="100" w:type="dxa"/>
-              <w:bottom w:w="100" w:type="dxa"/>
-              <w:right w:w="100" w:type="dxa"/>
-            </w:tcMar>
-            <w:vAlign w:val="center"/>
           </w:tcPr>
           <w:p>
             <w:pPr>
@@ -5391,20 +5557,53 @@
               <w:rPr>
                 <w:sz w:val="18"/>
               </w:rPr>
-              <w:t>3</w:t>
+              <w:t>6</w:t>
             </w:r>
           </w:p>
         </w:tc>
         <w:tc>
           <w:tcPr>
             <w:tcW w:w="3312" w:type="dxa"/>
-            <w:tcMar>
-              <w:top w:w="100" w:type="dxa"/>
-              <w:left w:w="100" w:type="dxa"/>
-              <w:bottom w:w="100" w:type="dxa"/>
-              <w:right w:w="100" w:type="dxa"/>
-            </w:tcMar>
-            <w:vAlign w:val="center"/>
+          </w:tcPr>
+          <w:p>
+            <w:pPr>
+              <w:jc w:val="center"/>
+              <w:cnfStyle w:val="000000000000" w:firstRow="0" w:lastRow="0" w:firstColumn="0" w:lastColumn="0" w:oddVBand="0" w:evenVBand="0" w:oddHBand="0" w:evenHBand="0" w:firstRowFirstColumn="0" w:firstRowLastColumn="0" w:lastRowFirstColumn="0" w:lastRowLastColumn="0"/>
+            </w:pPr>
+            <w:r>
+              <w:rPr>
+                <w:sz w:val="18"/>
+              </w:rPr>
+              <w:t>0.1400</w:t>
+            </w:r>
+          </w:p>
+        </w:tc>
+        <w:tc>
+          <w:tcPr>
+            <w:tcW w:w="3312" w:type="dxa"/>
+          </w:tcPr>
+          <w:p>
+            <w:pPr>
+              <w:jc w:val="center"/>
+              <w:cnfStyle w:val="000000000000" w:firstRow="0" w:lastRow="0" w:firstColumn="0" w:lastColumn="0" w:oddVBand="0" w:evenVBand="0" w:oddHBand="0" w:evenHBand="0" w:firstRowFirstColumn="0" w:firstRowLastColumn="0" w:lastRowFirstColumn="0" w:lastRowLastColumn="0"/>
+            </w:pPr>
+            <w:r>
+              <w:rPr>
+                <w:sz w:val="18"/>
+              </w:rPr>
+              <w:t>0.1412</w:t>
+            </w:r>
+          </w:p>
+        </w:tc>
+      </w:tr>
+      <w:tr>
+        <w:trPr>
+          <w:cnfStyle w:val="000000100000" w:firstRow="0" w:lastRow="0" w:firstColumn="0" w:lastColumn="0" w:oddVBand="0" w:evenVBand="0" w:oddHBand="1" w:evenHBand="0" w:firstRowFirstColumn="0" w:firstRowLastColumn="0" w:lastRowFirstColumn="0" w:lastRowLastColumn="0"/>
+        </w:trPr>
+        <w:tc>
+          <w:tcPr>
+            <w:cnfStyle w:val="001000000000" w:firstRow="0" w:lastRow="0" w:firstColumn="1" w:lastColumn="0" w:oddVBand="0" w:evenVBand="0" w:oddHBand="0" w:evenHBand="0" w:firstRowFirstColumn="0" w:firstRowLastColumn="0" w:lastRowFirstColumn="0" w:lastRowLastColumn="0"/>
+            <w:tcW w:w="1152" w:type="dxa"/>
           </w:tcPr>
           <w:p>
             <w:pPr>
@@ -5414,30 +5613,41 @@
               <w:rPr>
                 <w:sz w:val="18"/>
               </w:rPr>
-              <w:t>0.0950</w:t>
+              <w:t>7</w:t>
             </w:r>
           </w:p>
         </w:tc>
         <w:tc>
           <w:tcPr>
             <w:tcW w:w="3312" w:type="dxa"/>
-            <w:tcMar>
-              <w:top w:w="100" w:type="dxa"/>
-              <w:left w:w="100" w:type="dxa"/>
-              <w:bottom w:w="100" w:type="dxa"/>
-              <w:right w:w="100" w:type="dxa"/>
-            </w:tcMar>
-            <w:vAlign w:val="center"/>
           </w:tcPr>
           <w:p>
             <w:pPr>
               <w:jc w:val="center"/>
+              <w:cnfStyle w:val="000000100000" w:firstRow="0" w:lastRow="0" w:firstColumn="0" w:lastColumn="0" w:oddVBand="0" w:evenVBand="0" w:oddHBand="1" w:evenHBand="0" w:firstRowFirstColumn="0" w:firstRowLastColumn="0" w:lastRowFirstColumn="0" w:lastRowLastColumn="0"/>
             </w:pPr>
             <w:r>
               <w:rPr>
                 <w:sz w:val="18"/>
               </w:rPr>
-              <w:t>0.0947</w:t>
+              <w:t>0.1550</w:t>
+            </w:r>
+          </w:p>
+        </w:tc>
+        <w:tc>
+          <w:tcPr>
+            <w:tcW w:w="3312" w:type="dxa"/>
+          </w:tcPr>
+          <w:p>
+            <w:pPr>
+              <w:jc w:val="center"/>
+              <w:cnfStyle w:val="000000100000" w:firstRow="0" w:lastRow="0" w:firstColumn="0" w:lastColumn="0" w:oddVBand="0" w:evenVBand="0" w:oddHBand="1" w:evenHBand="0" w:firstRowFirstColumn="0" w:firstRowLastColumn="0" w:lastRowFirstColumn="0" w:lastRowLastColumn="0"/>
+            </w:pPr>
+            <w:r>
+              <w:rPr>
+                <w:sz w:val="18"/>
+              </w:rPr>
+              <w:t>0.1567</w:t>
             </w:r>
           </w:p>
         </w:tc>
@@ -5445,15 +5655,8 @@
       <w:tr>
         <w:tc>
           <w:tcPr>
+            <w:cnfStyle w:val="001000000000" w:firstRow="0" w:lastRow="0" w:firstColumn="1" w:lastColumn="0" w:oddVBand="0" w:evenVBand="0" w:oddHBand="0" w:evenHBand="0" w:firstRowFirstColumn="0" w:firstRowLastColumn="0" w:lastRowFirstColumn="0" w:lastRowLastColumn="0"/>
             <w:tcW w:w="1152" w:type="dxa"/>
-            <w:shd w:val="clear" w:color="auto" w:fill="D9EAF7"/>
-            <w:tcMar>
-              <w:top w:w="100" w:type="dxa"/>
-              <w:left w:w="100" w:type="dxa"/>
-              <w:bottom w:w="100" w:type="dxa"/>
-              <w:right w:w="100" w:type="dxa"/>
-            </w:tcMar>
-            <w:vAlign w:val="center"/>
           </w:tcPr>
           <w:p>
             <w:pPr>
@@ -5463,340 +5666,35 @@
               <w:rPr>
                 <w:sz w:val="18"/>
               </w:rPr>
-              <w:t>4</w:t>
+              <w:t>8</w:t>
             </w:r>
           </w:p>
         </w:tc>
         <w:tc>
           <w:tcPr>
             <w:tcW w:w="3312" w:type="dxa"/>
-            <w:shd w:val="clear" w:color="auto" w:fill="D9EAF7"/>
-            <w:tcMar>
-              <w:top w:w="100" w:type="dxa"/>
-              <w:left w:w="100" w:type="dxa"/>
-              <w:bottom w:w="100" w:type="dxa"/>
-              <w:right w:w="100" w:type="dxa"/>
-            </w:tcMar>
-            <w:vAlign w:val="center"/>
           </w:tcPr>
           <w:p>
             <w:pPr>
               <w:jc w:val="center"/>
+              <w:cnfStyle w:val="000000000000" w:firstRow="0" w:lastRow="0" w:firstColumn="0" w:lastColumn="0" w:oddVBand="0" w:evenVBand="0" w:oddHBand="0" w:evenHBand="0" w:firstRowFirstColumn="0" w:firstRowLastColumn="0" w:lastRowFirstColumn="0" w:lastRowLastColumn="0"/>
             </w:pPr>
             <w:r>
               <w:rPr>
                 <w:sz w:val="18"/>
               </w:rPr>
-              <w:t>0.1100</w:t>
+              <w:t>0.1700</w:t>
             </w:r>
           </w:p>
         </w:tc>
         <w:tc>
           <w:tcPr>
             <w:tcW w:w="3312" w:type="dxa"/>
-            <w:shd w:val="clear" w:color="auto" w:fill="D9EAF7"/>
-            <w:tcMar>
-              <w:top w:w="100" w:type="dxa"/>
-              <w:left w:w="100" w:type="dxa"/>
-              <w:bottom w:w="100" w:type="dxa"/>
-              <w:right w:w="100" w:type="dxa"/>
-            </w:tcMar>
-            <w:vAlign w:val="center"/>
           </w:tcPr>
           <w:p>
             <w:pPr>
               <w:jc w:val="center"/>
-            </w:pPr>
-            <w:r>
-              <w:rPr>
-                <w:sz w:val="18"/>
-              </w:rPr>
-              <w:t>0.1101</w:t>
-            </w:r>
-          </w:p>
-        </w:tc>
-      </w:tr>
-      <w:tr>
-        <w:tc>
-          <w:tcPr>
-            <w:tcW w:w="1152" w:type="dxa"/>
-            <w:tcMar>
-              <w:top w:w="100" w:type="dxa"/>
-              <w:left w:w="100" w:type="dxa"/>
-              <w:bottom w:w="100" w:type="dxa"/>
-              <w:right w:w="100" w:type="dxa"/>
-            </w:tcMar>
-            <w:vAlign w:val="center"/>
-          </w:tcPr>
-          <w:p>
-            <w:pPr>
-              <w:jc w:val="center"/>
-            </w:pPr>
-            <w:r>
-              <w:rPr>
-                <w:sz w:val="18"/>
-              </w:rPr>
-              <w:lastRenderedPageBreak/>
-              <w:t>5</w:t>
-            </w:r>
-          </w:p>
-        </w:tc>
-        <w:tc>
-          <w:tcPr>
-            <w:tcW w:w="3312" w:type="dxa"/>
-            <w:tcMar>
-              <w:top w:w="100" w:type="dxa"/>
-              <w:left w:w="100" w:type="dxa"/>
-              <w:bottom w:w="100" w:type="dxa"/>
-              <w:right w:w="100" w:type="dxa"/>
-            </w:tcMar>
-            <w:vAlign w:val="center"/>
-          </w:tcPr>
-          <w:p>
-            <w:pPr>
-              <w:jc w:val="center"/>
-            </w:pPr>
-            <w:r>
-              <w:rPr>
-                <w:sz w:val="18"/>
-              </w:rPr>
-              <w:t>0.1250</w:t>
-            </w:r>
-          </w:p>
-        </w:tc>
-        <w:tc>
-          <w:tcPr>
-            <w:tcW w:w="3312" w:type="dxa"/>
-            <w:tcMar>
-              <w:top w:w="100" w:type="dxa"/>
-              <w:left w:w="100" w:type="dxa"/>
-              <w:bottom w:w="100" w:type="dxa"/>
-              <w:right w:w="100" w:type="dxa"/>
-            </w:tcMar>
-            <w:vAlign w:val="center"/>
-          </w:tcPr>
-          <w:p>
-            <w:pPr>
-              <w:jc w:val="center"/>
-            </w:pPr>
-            <w:r>
-              <w:rPr>
-                <w:sz w:val="18"/>
-              </w:rPr>
-              <w:t>0.1220</w:t>
-            </w:r>
-          </w:p>
-        </w:tc>
-      </w:tr>
-      <w:tr>
-        <w:tc>
-          <w:tcPr>
-            <w:tcW w:w="1152" w:type="dxa"/>
-            <w:shd w:val="clear" w:color="auto" w:fill="D9EAF7"/>
-            <w:tcMar>
-              <w:top w:w="100" w:type="dxa"/>
-              <w:left w:w="100" w:type="dxa"/>
-              <w:bottom w:w="100" w:type="dxa"/>
-              <w:right w:w="100" w:type="dxa"/>
-            </w:tcMar>
-            <w:vAlign w:val="center"/>
-          </w:tcPr>
-          <w:p>
-            <w:pPr>
-              <w:jc w:val="center"/>
-            </w:pPr>
-            <w:r>
-              <w:rPr>
-                <w:sz w:val="18"/>
-              </w:rPr>
-              <w:t>6</w:t>
-            </w:r>
-          </w:p>
-        </w:tc>
-        <w:tc>
-          <w:tcPr>
-            <w:tcW w:w="3312" w:type="dxa"/>
-            <w:shd w:val="clear" w:color="auto" w:fill="D9EAF7"/>
-            <w:tcMar>
-              <w:top w:w="100" w:type="dxa"/>
-              <w:left w:w="100" w:type="dxa"/>
-              <w:bottom w:w="100" w:type="dxa"/>
-              <w:right w:w="100" w:type="dxa"/>
-            </w:tcMar>
-            <w:vAlign w:val="center"/>
-          </w:tcPr>
-          <w:p>
-            <w:pPr>
-              <w:jc w:val="center"/>
-            </w:pPr>
-            <w:r>
-              <w:rPr>
-                <w:sz w:val="18"/>
-              </w:rPr>
-              <w:t>0.1400</w:t>
-            </w:r>
-          </w:p>
-        </w:tc>
-        <w:tc>
-          <w:tcPr>
-            <w:tcW w:w="3312" w:type="dxa"/>
-            <w:shd w:val="clear" w:color="auto" w:fill="D9EAF7"/>
-            <w:tcMar>
-              <w:top w:w="100" w:type="dxa"/>
-              <w:left w:w="100" w:type="dxa"/>
-              <w:bottom w:w="100" w:type="dxa"/>
-              <w:right w:w="100" w:type="dxa"/>
-            </w:tcMar>
-            <w:vAlign w:val="center"/>
-          </w:tcPr>
-          <w:p>
-            <w:pPr>
-              <w:jc w:val="center"/>
-            </w:pPr>
-            <w:r>
-              <w:rPr>
-                <w:sz w:val="18"/>
-              </w:rPr>
-              <w:t>0.1412</w:t>
-            </w:r>
-          </w:p>
-        </w:tc>
-      </w:tr>
-      <w:tr>
-        <w:tc>
-          <w:tcPr>
-            <w:tcW w:w="1152" w:type="dxa"/>
-            <w:tcMar>
-              <w:top w:w="100" w:type="dxa"/>
-              <w:left w:w="100" w:type="dxa"/>
-              <w:bottom w:w="100" w:type="dxa"/>
-              <w:right w:w="100" w:type="dxa"/>
-            </w:tcMar>
-            <w:vAlign w:val="center"/>
-          </w:tcPr>
-          <w:p>
-            <w:pPr>
-              <w:jc w:val="center"/>
-            </w:pPr>
-            <w:r>
-              <w:rPr>
-                <w:sz w:val="18"/>
-              </w:rPr>
-              <w:t>7</w:t>
-            </w:r>
-          </w:p>
-        </w:tc>
-        <w:tc>
-          <w:tcPr>
-            <w:tcW w:w="3312" w:type="dxa"/>
-            <w:tcMar>
-              <w:top w:w="100" w:type="dxa"/>
-              <w:left w:w="100" w:type="dxa"/>
-              <w:bottom w:w="100" w:type="dxa"/>
-              <w:right w:w="100" w:type="dxa"/>
-            </w:tcMar>
-            <w:vAlign w:val="center"/>
-          </w:tcPr>
-          <w:p>
-            <w:pPr>
-              <w:jc w:val="center"/>
-            </w:pPr>
-            <w:r>
-              <w:rPr>
-                <w:sz w:val="18"/>
-              </w:rPr>
-              <w:t>0.1550</w:t>
-            </w:r>
-          </w:p>
-        </w:tc>
-        <w:tc>
-          <w:tcPr>
-            <w:tcW w:w="3312" w:type="dxa"/>
-            <w:tcMar>
-              <w:top w:w="100" w:type="dxa"/>
-              <w:left w:w="100" w:type="dxa"/>
-              <w:bottom w:w="100" w:type="dxa"/>
-              <w:right w:w="100" w:type="dxa"/>
-            </w:tcMar>
-            <w:vAlign w:val="center"/>
-          </w:tcPr>
-          <w:p>
-            <w:pPr>
-              <w:jc w:val="center"/>
-            </w:pPr>
-            <w:r>
-              <w:rPr>
-                <w:sz w:val="18"/>
-              </w:rPr>
-              <w:t>0.1567</w:t>
-            </w:r>
-          </w:p>
-        </w:tc>
-      </w:tr>
-      <w:tr>
-        <w:tc>
-          <w:tcPr>
-            <w:tcW w:w="1152" w:type="dxa"/>
-            <w:shd w:val="clear" w:color="auto" w:fill="D9EAF7"/>
-            <w:tcMar>
-              <w:top w:w="100" w:type="dxa"/>
-              <w:left w:w="100" w:type="dxa"/>
-              <w:bottom w:w="100" w:type="dxa"/>
-              <w:right w:w="100" w:type="dxa"/>
-            </w:tcMar>
-            <w:vAlign w:val="center"/>
-          </w:tcPr>
-          <w:p>
-            <w:pPr>
-              <w:jc w:val="center"/>
-            </w:pPr>
-            <w:r>
-              <w:rPr>
-                <w:sz w:val="18"/>
-              </w:rPr>
-              <w:t>8</w:t>
-            </w:r>
-          </w:p>
-        </w:tc>
-        <w:tc>
-          <w:tcPr>
-            <w:tcW w:w="3312" w:type="dxa"/>
-            <w:shd w:val="clear" w:color="auto" w:fill="D9EAF7"/>
-            <w:tcMar>
-              <w:top w:w="100" w:type="dxa"/>
-              <w:left w:w="100" w:type="dxa"/>
-              <w:bottom w:w="100" w:type="dxa"/>
-              <w:right w:w="100" w:type="dxa"/>
-            </w:tcMar>
-            <w:vAlign w:val="center"/>
-          </w:tcPr>
-          <w:p>
-            <w:pPr>
-              <w:jc w:val="center"/>
-            </w:pPr>
-            <w:r>
-              <w:rPr>
-                <w:sz w:val="18"/>
-              </w:rPr>
-              <w:t>0.1700</w:t>
-            </w:r>
-          </w:p>
-        </w:tc>
-        <w:tc>
-          <w:tcPr>
-            <w:tcW w:w="3312" w:type="dxa"/>
-            <w:shd w:val="clear" w:color="auto" w:fill="D9EAF7"/>
-            <w:tcMar>
-              <w:top w:w="100" w:type="dxa"/>
-              <w:left w:w="100" w:type="dxa"/>
-              <w:bottom w:w="100" w:type="dxa"/>
-              <w:right w:w="100" w:type="dxa"/>
-            </w:tcMar>
-            <w:vAlign w:val="center"/>
-          </w:tcPr>
-          <w:p>
-            <w:pPr>
-              <w:jc w:val="center"/>
+              <w:cnfStyle w:val="000000000000" w:firstRow="0" w:lastRow="0" w:firstColumn="0" w:lastColumn="0" w:oddVBand="0" w:evenVBand="0" w:oddHBand="0" w:evenHBand="0" w:firstRowFirstColumn="0" w:firstRowLastColumn="0" w:lastRowFirstColumn="0" w:lastRowLastColumn="0"/>
             </w:pPr>
             <w:r>
               <w:rPr>
@@ -5818,6 +5716,7 @@
         <w:rPr>
           <w:lang w:val="es-GT"/>
         </w:rPr>
+        <w:lastRenderedPageBreak/>
         <w:drawing>
           <wp:inline distT="0" distB="0" distL="0" distR="0" wp14:anchorId="03CC452E" wp14:editId="4E86B58D">
             <wp:extent cx="4292821" cy="1905098"/>
@@ -6487,7 +6386,6 @@
           <w:b/>
           <w:sz w:val="24"/>
         </w:rPr>
-        <w:lastRenderedPageBreak/>
         <w:t>P(</w:t>
       </w:r>
       <w:proofErr w:type="gramEnd"/>
@@ -6584,6 +6482,7 @@
           <w:b/>
           <w:sz w:val="24"/>
         </w:rPr>
+        <w:lastRenderedPageBreak/>
         <w:t>P(</w:t>
       </w:r>
       <w:proofErr w:type="gramEnd"/>
@@ -6894,6 +6793,9 @@
         <w:t>(e</w:t>
       </w:r>
       <w:r>
+        <w:rPr>
+          <w:rFonts w:ascii="Arial" w:hAnsi="Arial" w:cs="Arial"/>
+        </w:rPr>
         <w:t>ᵁ</w:t>
       </w:r>
       <w:r>
@@ -6947,12 +6849,22 @@
       <w:proofErr w:type="gramEnd"/>
       <w:r>
         <w:rPr>
+          <w:rFonts w:ascii="Gadugi" w:hAnsi="Gadugi" w:cs="Gadugi"/>
+          <w:b/>
+          <w:sz w:val="24"/>
+        </w:rPr>
+        <w:t>ᐟ</w:t>
+      </w:r>
+      <w:r>
+        <w:rPr>
           <w:rFonts w:ascii="Cambria Math" w:hAnsi="Cambria Math"/>
           <w:b/>
           <w:sz w:val="24"/>
-        </w:rPr>
-        <w:t>ᐟ</w:t>
-      </w:r>
+          <w:lang w:val="es-GT"/>
+        </w:rPr>
+        <w:t xml:space="preserve">² </w:t>
+      </w:r>
+      <w:proofErr w:type="spellStart"/>
       <w:r>
         <w:rPr>
           <w:rFonts w:ascii="Cambria Math" w:hAnsi="Cambria Math"/>
@@ -6960,9 +6872,65 @@
           <w:sz w:val="24"/>
           <w:lang w:val="es-GT"/>
         </w:rPr>
-        <w:t xml:space="preserve">² </w:t>
-      </w:r>
-      <w:proofErr w:type="spellStart"/>
+        <w:t>dx</w:t>
+      </w:r>
+      <w:proofErr w:type="spellEnd"/>
+    </w:p>
+    <w:p>
+      <w:pPr>
+        <w:rPr>
+          <w:lang w:val="es-GT"/>
+        </w:rPr>
+      </w:pPr>
+      <w:r>
+        <w:rPr>
+          <w:lang w:val="es-GT"/>
+        </w:rPr>
+        <w:t>Con U uniforme en [0,1], la integral es E[(1−U</w:t>
+      </w:r>
+      <w:proofErr w:type="gramStart"/>
+      <w:r>
+        <w:rPr>
+          <w:lang w:val="es-GT"/>
+        </w:rPr>
+        <w:t>²)³</w:t>
+      </w:r>
+      <w:proofErr w:type="gramEnd"/>
+      <w:r>
+        <w:rPr>
+          <w:rFonts w:ascii="Gadugi" w:hAnsi="Gadugi" w:cs="Gadugi"/>
+        </w:rPr>
+        <w:t>ᐟ</w:t>
+      </w:r>
+      <w:r>
+        <w:rPr>
+          <w:lang w:val="es-GT"/>
+        </w:rPr>
+        <w:t>²]. La respuesta exacta se obtiene por una sustitución trigonométrica.</w:t>
+      </w:r>
+    </w:p>
+    <w:p>
+      <w:pPr>
+        <w:pStyle w:val="Heading2"/>
+        <w:spacing w:after="120"/>
+        <w:rPr>
+          <w:lang w:val="es-GT"/>
+        </w:rPr>
+      </w:pPr>
+      <w:r>
+        <w:rPr>
+          <w:lang w:val="es-GT"/>
+        </w:rPr>
+        <w:t>Inciso 5</w:t>
+      </w:r>
+    </w:p>
+    <w:p>
+      <w:pPr>
+        <w:jc w:val="center"/>
+        <w:rPr>
+          <w:lang w:val="es-GT"/>
+        </w:rPr>
+      </w:pPr>
       <w:r>
         <w:rPr>
           <w:rFonts w:ascii="Cambria Math" w:hAnsi="Cambria Math"/>
@@ -6970,62 +6938,9 @@
           <w:sz w:val="24"/>
           <w:lang w:val="es-GT"/>
         </w:rPr>
-        <w:t>dx</w:t>
-      </w:r>
-      <w:proofErr w:type="spellEnd"/>
-    </w:p>
-    <w:p>
-      <w:pPr>
-        <w:rPr>
-          <w:lang w:val="es-GT"/>
-        </w:rPr>
-      </w:pPr>
-      <w:r>
-        <w:rPr>
-          <w:lang w:val="es-GT"/>
-        </w:rPr>
-        <w:t>Con U uniforme en [0,1], la integral es E[(1−U</w:t>
+        <w:t>∫₋₂² e</w:t>
       </w:r>
       <w:proofErr w:type="gramStart"/>
-      <w:r>
-        <w:rPr>
-          <w:lang w:val="es-GT"/>
-        </w:rPr>
-        <w:t>²)³</w:t>
-      </w:r>
-      <w:proofErr w:type="gramEnd"/>
-      <w:r>
-        <w:t>ᐟ</w:t>
-      </w:r>
-      <w:r>
-        <w:rPr>
-          <w:lang w:val="es-GT"/>
-        </w:rPr>
-        <w:t>²]. La respuesta exacta se obtiene por una sustitución trigonométrica.</w:t>
-      </w:r>
-    </w:p>
-    <w:p>
-      <w:pPr>
-        <w:pStyle w:val="Heading2"/>
-        <w:spacing w:after="120"/>
-        <w:rPr>
-          <w:lang w:val="es-GT"/>
-        </w:rPr>
-      </w:pPr>
-      <w:r>
-        <w:rPr>
-          <w:lang w:val="es-GT"/>
-        </w:rPr>
-        <w:t>Inciso 5</w:t>
-      </w:r>
-    </w:p>
-    <w:p>
-      <w:pPr>
-        <w:jc w:val="center"/>
-        <w:rPr>
-          <w:lang w:val="es-GT"/>
-        </w:rPr>
-      </w:pPr>
       <w:r>
         <w:rPr>
           <w:rFonts w:ascii="Cambria Math" w:hAnsi="Cambria Math"/>
@@ -7033,9 +6948,9 @@
           <w:sz w:val="24"/>
           <w:lang w:val="es-GT"/>
         </w:rPr>
-        <w:t>∫₋₂² e</w:t>
-      </w:r>
-      <w:proofErr w:type="gramStart"/>
+        <w:t>^(</w:t>
+      </w:r>
+      <w:proofErr w:type="gramEnd"/>
       <w:r>
         <w:rPr>
           <w:rFonts w:ascii="Cambria Math" w:hAnsi="Cambria Math"/>
@@ -7043,9 +6958,9 @@
           <w:sz w:val="24"/>
           <w:lang w:val="es-GT"/>
         </w:rPr>
-        <w:t>^(</w:t>
-      </w:r>
-      <w:proofErr w:type="gramEnd"/>
+        <w:t xml:space="preserve">x + x²) </w:t>
+      </w:r>
+      <w:proofErr w:type="spellStart"/>
       <w:r>
         <w:rPr>
           <w:rFonts w:ascii="Cambria Math" w:hAnsi="Cambria Math"/>
@@ -7053,9 +6968,45 @@
           <w:sz w:val="24"/>
           <w:lang w:val="es-GT"/>
         </w:rPr>
-        <w:t xml:space="preserve">x + x²) </w:t>
-      </w:r>
-      <w:proofErr w:type="spellStart"/>
+        <w:t>dx</w:t>
+      </w:r>
+      <w:proofErr w:type="spellEnd"/>
+    </w:p>
+    <w:p>
+      <w:pPr>
+        <w:rPr>
+          <w:lang w:val="es-GT"/>
+        </w:rPr>
+      </w:pPr>
+      <w:r>
+        <w:rPr>
+          <w:lang w:val="es-GT"/>
+        </w:rPr>
+        <w:t>Se transforma U uniforme en [0,1] mediante X = −2 + 4U. Como el intervalo mide 4, el estimador es 4e^(X+X²).</w:t>
+      </w:r>
+    </w:p>
+    <w:p>
+      <w:pPr>
+        <w:pStyle w:val="Heading2"/>
+        <w:spacing w:after="120"/>
+        <w:rPr>
+          <w:lang w:val="es-GT"/>
+        </w:rPr>
+      </w:pPr>
+      <w:r>
+        <w:rPr>
+          <w:lang w:val="es-GT"/>
+        </w:rPr>
+        <w:t>Inciso 6</w:t>
+      </w:r>
+    </w:p>
+    <w:p>
+      <w:pPr>
+        <w:jc w:val="center"/>
+        <w:rPr>
+          <w:lang w:val="es-GT"/>
+        </w:rPr>
+      </w:pPr>
       <w:r>
         <w:rPr>
           <w:rFonts w:ascii="Cambria Math" w:hAnsi="Cambria Math"/>
@@ -7063,45 +7014,9 @@
           <w:sz w:val="24"/>
           <w:lang w:val="es-GT"/>
         </w:rPr>
-        <w:t>dx</w:t>
-      </w:r>
-      <w:proofErr w:type="spellEnd"/>
-    </w:p>
-    <w:p>
-      <w:pPr>
-        <w:rPr>
-          <w:lang w:val="es-GT"/>
-        </w:rPr>
-      </w:pPr>
-      <w:r>
-        <w:rPr>
-          <w:lang w:val="es-GT"/>
-        </w:rPr>
-        <w:t>Se transforma U uniforme en [0,1] mediante X = −2 + 4U. Como el intervalo mide 4, el estimador es 4e^(X+X²).</w:t>
-      </w:r>
-    </w:p>
-    <w:p>
-      <w:pPr>
-        <w:pStyle w:val="Heading2"/>
-        <w:spacing w:after="120"/>
-        <w:rPr>
-          <w:lang w:val="es-GT"/>
-        </w:rPr>
-      </w:pPr>
-      <w:r>
-        <w:rPr>
-          <w:lang w:val="es-GT"/>
-        </w:rPr>
-        <w:t>Inciso 6</w:t>
-      </w:r>
-    </w:p>
-    <w:p>
-      <w:pPr>
-        <w:jc w:val="center"/>
-        <w:rPr>
-          <w:lang w:val="es-GT"/>
-        </w:rPr>
-      </w:pPr>
+        <w:t xml:space="preserve">∫₀^∞ </w:t>
+      </w:r>
+      <w:proofErr w:type="gramStart"/>
       <w:r>
         <w:rPr>
           <w:rFonts w:ascii="Cambria Math" w:hAnsi="Cambria Math"/>
@@ -7109,9 +7024,9 @@
           <w:sz w:val="24"/>
           <w:lang w:val="es-GT"/>
         </w:rPr>
-        <w:t xml:space="preserve">∫₀^∞ </w:t>
-      </w:r>
-      <w:proofErr w:type="gramStart"/>
+        <w:t>x(</w:t>
+      </w:r>
+      <w:proofErr w:type="gramEnd"/>
       <w:r>
         <w:rPr>
           <w:rFonts w:ascii="Cambria Math" w:hAnsi="Cambria Math"/>
@@ -7119,9 +7034,9 @@
           <w:sz w:val="24"/>
           <w:lang w:val="es-GT"/>
         </w:rPr>
-        <w:t>x(</w:t>
-      </w:r>
-      <w:proofErr w:type="gramEnd"/>
+        <w:t>1 + x</w:t>
+      </w:r>
+      <w:proofErr w:type="gramStart"/>
       <w:r>
         <w:rPr>
           <w:rFonts w:ascii="Cambria Math" w:hAnsi="Cambria Math"/>
@@ -7129,9 +7044,9 @@
           <w:sz w:val="24"/>
           <w:lang w:val="es-GT"/>
         </w:rPr>
-        <w:t>1 + x</w:t>
-      </w:r>
-      <w:proofErr w:type="gramStart"/>
+        <w:t>²)⁻</w:t>
+      </w:r>
+      <w:proofErr w:type="gramEnd"/>
       <w:r>
         <w:rPr>
           <w:rFonts w:ascii="Cambria Math" w:hAnsi="Cambria Math"/>
@@ -7139,9 +7054,9 @@
           <w:sz w:val="24"/>
           <w:lang w:val="es-GT"/>
         </w:rPr>
-        <w:t>²)⁻</w:t>
-      </w:r>
-      <w:proofErr w:type="gramEnd"/>
+        <w:t xml:space="preserve">² </w:t>
+      </w:r>
+      <w:proofErr w:type="spellStart"/>
       <w:r>
         <w:rPr>
           <w:rFonts w:ascii="Cambria Math" w:hAnsi="Cambria Math"/>
@@ -7149,9 +7064,59 @@
           <w:sz w:val="24"/>
           <w:lang w:val="es-GT"/>
         </w:rPr>
-        <w:t xml:space="preserve">² </w:t>
-      </w:r>
-      <w:proofErr w:type="spellStart"/>
+        <w:t>dx</w:t>
+      </w:r>
+      <w:proofErr w:type="spellEnd"/>
+    </w:p>
+    <w:p>
+      <w:pPr>
+        <w:rPr>
+          <w:lang w:val="es-GT"/>
+        </w:rPr>
+      </w:pPr>
+      <w:r>
+        <w:rPr>
+          <w:lang w:val="es-GT"/>
+        </w:rPr>
+        <w:t>Para trabajar en un intervalo finito se usa X = U/(1−U), con jacobiano 1/(1−</w:t>
+      </w:r>
+      <w:proofErr w:type="gramStart"/>
+      <w:r>
+        <w:rPr>
+          <w:lang w:val="es-GT"/>
+        </w:rPr>
+        <w:t>U)²</w:t>
+      </w:r>
+      <w:proofErr w:type="gramEnd"/>
+      <w:r>
+        <w:rPr>
+          <w:lang w:val="es-GT"/>
+        </w:rPr>
+        <w:t>. El promedio incluye el integrando y este jacobiano.</w:t>
+      </w:r>
+    </w:p>
+    <w:p>
+      <w:pPr>
+        <w:pStyle w:val="Heading2"/>
+        <w:spacing w:after="120"/>
+        <w:rPr>
+          <w:lang w:val="es-GT"/>
+        </w:rPr>
+      </w:pPr>
+      <w:r>
+        <w:rPr>
+          <w:lang w:val="es-GT"/>
+        </w:rPr>
+        <w:t>Inciso 7</w:t>
+      </w:r>
+    </w:p>
+    <w:p>
+      <w:pPr>
+        <w:jc w:val="center"/>
+        <w:rPr>
+          <w:lang w:val="es-GT"/>
+        </w:rPr>
+      </w:pPr>
       <w:r>
         <w:rPr>
           <w:rFonts w:ascii="Cambria Math" w:hAnsi="Cambria Math"/>
@@ -7159,59 +7124,9 @@
           <w:sz w:val="24"/>
           <w:lang w:val="es-GT"/>
         </w:rPr>
-        <w:t>dx</w:t>
-      </w:r>
-      <w:proofErr w:type="spellEnd"/>
-    </w:p>
-    <w:p>
-      <w:pPr>
-        <w:rPr>
-          <w:lang w:val="es-GT"/>
-        </w:rPr>
-      </w:pPr>
-      <w:r>
-        <w:rPr>
-          <w:lang w:val="es-GT"/>
-        </w:rPr>
-        <w:t>Para trabajar en un intervalo finito se usa X = U/(1−U), con jacobiano 1/(1−</w:t>
-      </w:r>
-      <w:proofErr w:type="gramStart"/>
-      <w:r>
-        <w:rPr>
-          <w:lang w:val="es-GT"/>
-        </w:rPr>
-        <w:t>U)²</w:t>
-      </w:r>
-      <w:proofErr w:type="gramEnd"/>
-      <w:r>
-        <w:rPr>
-          <w:lang w:val="es-GT"/>
-        </w:rPr>
-        <w:t>. El promedio incluye el integrando y este jacobiano.</w:t>
-      </w:r>
-    </w:p>
-    <w:p>
-      <w:pPr>
-        <w:pStyle w:val="Heading2"/>
-        <w:spacing w:after="120"/>
-        <w:rPr>
-          <w:lang w:val="es-GT"/>
-        </w:rPr>
-      </w:pPr>
-      <w:r>
-        <w:rPr>
-          <w:lang w:val="es-GT"/>
-        </w:rPr>
-        <w:t>Inciso 7</w:t>
-      </w:r>
-    </w:p>
-    <w:p>
-      <w:pPr>
-        <w:jc w:val="center"/>
-        <w:rPr>
-          <w:lang w:val="es-GT"/>
-        </w:rPr>
-      </w:pPr>
+        <w:t xml:space="preserve">∫₋∞^∞ e^(−x²) </w:t>
+      </w:r>
+      <w:proofErr w:type="spellStart"/>
       <w:r>
         <w:rPr>
           <w:rFonts w:ascii="Cambria Math" w:hAnsi="Cambria Math"/>
@@ -7219,9 +7134,81 @@
           <w:sz w:val="24"/>
           <w:lang w:val="es-GT"/>
         </w:rPr>
-        <w:t xml:space="preserve">∫₋∞^∞ e^(−x²) </w:t>
-      </w:r>
-      <w:proofErr w:type="spellStart"/>
+        <w:t>dx</w:t>
+      </w:r>
+      <w:proofErr w:type="spellEnd"/>
+    </w:p>
+    <w:p>
+      <w:pPr>
+        <w:rPr>
+          <w:lang w:val="es-GT"/>
+        </w:rPr>
+      </w:pPr>
+      <w:r>
+        <w:rPr>
+          <w:lang w:val="es-GT"/>
+        </w:rPr>
+        <w:t>La transformación X = tan(</w:t>
+      </w:r>
+      <w:r>
+        <w:t>π</w:t>
+      </w:r>
+      <w:r>
+        <w:rPr>
+          <w:lang w:val="es-GT"/>
+        </w:rPr>
+        <w:t xml:space="preserve">(U−1/2)) cubre toda la recta real. Su jacobiano es </w:t>
+      </w:r>
+      <w:r>
+        <w:t>π</w:t>
+      </w:r>
+      <w:r>
+        <w:rPr>
+          <w:lang w:val="es-GT"/>
+        </w:rPr>
+        <w:t>(1+X²), por lo que se promedia e^(−X</w:t>
+      </w:r>
+      <w:proofErr w:type="gramStart"/>
+      <w:r>
+        <w:rPr>
+          <w:lang w:val="es-GT"/>
+        </w:rPr>
+        <w:t>²)</w:t>
+      </w:r>
+      <w:r>
+        <w:t>π</w:t>
+      </w:r>
+      <w:proofErr w:type="gramEnd"/>
+      <w:r>
+        <w:rPr>
+          <w:lang w:val="es-GT"/>
+        </w:rPr>
+        <w:t>(1+X²).</w:t>
+      </w:r>
+    </w:p>
+    <w:p>
+      <w:pPr>
+        <w:pStyle w:val="Heading2"/>
+        <w:spacing w:after="120"/>
+        <w:rPr>
+          <w:lang w:val="es-GT"/>
+        </w:rPr>
+      </w:pPr>
+      <w:r>
+        <w:rPr>
+          <w:lang w:val="es-GT"/>
+        </w:rPr>
+        <w:lastRenderedPageBreak/>
+        <w:t>Inciso 8</w:t>
+      </w:r>
+    </w:p>
+    <w:p>
+      <w:pPr>
+        <w:jc w:val="center"/>
+        <w:rPr>
+          <w:lang w:val="es-GT"/>
+        </w:rPr>
+      </w:pPr>
       <w:r>
         <w:rPr>
           <w:rFonts w:ascii="Cambria Math" w:hAnsi="Cambria Math"/>
@@ -7229,80 +7216,9 @@
           <w:sz w:val="24"/>
           <w:lang w:val="es-GT"/>
         </w:rPr>
-        <w:t>dx</w:t>
-      </w:r>
-      <w:proofErr w:type="spellEnd"/>
-    </w:p>
-    <w:p>
-      <w:pPr>
-        <w:rPr>
-          <w:lang w:val="es-GT"/>
-        </w:rPr>
-      </w:pPr>
-      <w:r>
-        <w:rPr>
-          <w:lang w:val="es-GT"/>
-        </w:rPr>
-        <w:t>La transformación X = tan(</w:t>
-      </w:r>
-      <w:r>
-        <w:t>π</w:t>
-      </w:r>
-      <w:r>
-        <w:rPr>
-          <w:lang w:val="es-GT"/>
-        </w:rPr>
-        <w:t xml:space="preserve">(U−1/2)) cubre toda la recta real. Su jacobiano es </w:t>
-      </w:r>
-      <w:r>
-        <w:t>π</w:t>
-      </w:r>
-      <w:r>
-        <w:rPr>
-          <w:lang w:val="es-GT"/>
-        </w:rPr>
-        <w:t>(1+X²), por lo que se promedia e^(−X</w:t>
-      </w:r>
-      <w:proofErr w:type="gramStart"/>
-      <w:r>
-        <w:rPr>
-          <w:lang w:val="es-GT"/>
-        </w:rPr>
-        <w:t>²)</w:t>
-      </w:r>
-      <w:r>
-        <w:t>π</w:t>
-      </w:r>
-      <w:proofErr w:type="gramEnd"/>
-      <w:r>
-        <w:rPr>
-          <w:lang w:val="es-GT"/>
-        </w:rPr>
-        <w:t>(1+X²).</w:t>
-      </w:r>
-    </w:p>
-    <w:p>
-      <w:pPr>
-        <w:pStyle w:val="Heading2"/>
-        <w:spacing w:after="120"/>
-        <w:rPr>
-          <w:lang w:val="es-GT"/>
-        </w:rPr>
-      </w:pPr>
-      <w:r>
-        <w:rPr>
-          <w:lang w:val="es-GT"/>
-        </w:rPr>
-        <w:t>Inciso 8</w:t>
-      </w:r>
-    </w:p>
-    <w:p>
-      <w:pPr>
-        <w:jc w:val="center"/>
-        <w:rPr>
-          <w:lang w:val="es-GT"/>
-        </w:rPr>
-      </w:pPr>
+        <w:t>∫₀¹ ∫₀¹ e^((</w:t>
+      </w:r>
+      <w:proofErr w:type="spellStart"/>
       <w:r>
         <w:rPr>
           <w:rFonts w:ascii="Cambria Math" w:hAnsi="Cambria Math"/>
@@ -7310,9 +7226,9 @@
           <w:sz w:val="24"/>
           <w:lang w:val="es-GT"/>
         </w:rPr>
-        <w:t>∫₀¹ ∫₀¹ e^((</w:t>
-      </w:r>
-      <w:proofErr w:type="spellStart"/>
+        <w:t>x+</w:t>
+      </w:r>
+      <w:proofErr w:type="gramStart"/>
       <w:r>
         <w:rPr>
           <w:rFonts w:ascii="Cambria Math" w:hAnsi="Cambria Math"/>
@@ -7320,9 +7236,9 @@
           <w:sz w:val="24"/>
           <w:lang w:val="es-GT"/>
         </w:rPr>
-        <w:t>x+</w:t>
-      </w:r>
-      <w:proofErr w:type="gramStart"/>
+        <w:t>y</w:t>
+      </w:r>
+      <w:proofErr w:type="spellEnd"/>
       <w:r>
         <w:rPr>
           <w:rFonts w:ascii="Cambria Math" w:hAnsi="Cambria Math"/>
@@ -7330,9 +7246,9 @@
           <w:sz w:val="24"/>
           <w:lang w:val="es-GT"/>
         </w:rPr>
-        <w:t>y</w:t>
-      </w:r>
-      <w:proofErr w:type="spellEnd"/>
+        <w:t>)²</w:t>
+      </w:r>
+      <w:proofErr w:type="gramEnd"/>
       <w:r>
         <w:rPr>
           <w:rFonts w:ascii="Cambria Math" w:hAnsi="Cambria Math"/>
@@ -7340,9 +7256,9 @@
           <w:sz w:val="24"/>
           <w:lang w:val="es-GT"/>
         </w:rPr>
-        <w:t>)²</w:t>
-      </w:r>
-      <w:proofErr w:type="gramEnd"/>
+        <w:t xml:space="preserve">) </w:t>
+      </w:r>
+      <w:proofErr w:type="spellStart"/>
       <w:r>
         <w:rPr>
           <w:rFonts w:ascii="Cambria Math" w:hAnsi="Cambria Math"/>
@@ -7350,9 +7266,9 @@
           <w:sz w:val="24"/>
           <w:lang w:val="es-GT"/>
         </w:rPr>
-        <w:t xml:space="preserve">) </w:t>
-      </w:r>
-      <w:proofErr w:type="spellStart"/>
+        <w:t>dy</w:t>
+      </w:r>
+      <w:proofErr w:type="spellEnd"/>
       <w:r>
         <w:rPr>
           <w:rFonts w:ascii="Cambria Math" w:hAnsi="Cambria Math"/>
@@ -7360,9 +7276,9 @@
           <w:sz w:val="24"/>
           <w:lang w:val="es-GT"/>
         </w:rPr>
-        <w:t>dy</w:t>
-      </w:r>
-      <w:proofErr w:type="spellEnd"/>
+        <w:t xml:space="preserve"> </w:t>
+      </w:r>
+      <w:proofErr w:type="spellStart"/>
       <w:r>
         <w:rPr>
           <w:rFonts w:ascii="Cambria Math" w:hAnsi="Cambria Math"/>
@@ -7370,9 +7286,59 @@
           <w:sz w:val="24"/>
           <w:lang w:val="es-GT"/>
         </w:rPr>
-        <w:t xml:space="preserve"> </w:t>
-      </w:r>
-      <w:proofErr w:type="spellStart"/>
+        <w:t>dx</w:t>
+      </w:r>
+      <w:proofErr w:type="spellEnd"/>
+    </w:p>
+    <w:p>
+      <w:pPr>
+        <w:rPr>
+          <w:lang w:val="es-GT"/>
+        </w:rPr>
+      </w:pPr>
+      <w:r>
+        <w:rPr>
+          <w:lang w:val="es-GT"/>
+        </w:rPr>
+        <w:t>Se generan U y V independientes y uniformes en [0,1]. Como el área del cuadrado es 1, la integral es E[e^((U+</w:t>
+      </w:r>
+      <w:proofErr w:type="gramStart"/>
+      <w:r>
+        <w:rPr>
+          <w:lang w:val="es-GT"/>
+        </w:rPr>
+        <w:t>V)²</w:t>
+      </w:r>
+      <w:proofErr w:type="gramEnd"/>
+      <w:r>
+        <w:rPr>
+          <w:lang w:val="es-GT"/>
+        </w:rPr>
+        <w:t>)].</w:t>
+      </w:r>
+    </w:p>
+    <w:p>
+      <w:pPr>
+        <w:pStyle w:val="Heading2"/>
+        <w:spacing w:after="120"/>
+        <w:rPr>
+          <w:lang w:val="es-GT"/>
+        </w:rPr>
+      </w:pPr>
+      <w:r>
+        <w:rPr>
+          <w:lang w:val="es-GT"/>
+        </w:rPr>
+        <w:t>Inciso 9</w:t>
+      </w:r>
+    </w:p>
+    <w:p>
+      <w:pPr>
+        <w:jc w:val="center"/>
+        <w:rPr>
+          <w:lang w:val="es-GT"/>
+        </w:rPr>
+      </w:pPr>
       <w:r>
         <w:rPr>
           <w:rFonts w:ascii="Cambria Math" w:hAnsi="Cambria Math"/>
@@ -7380,59 +7346,9 @@
           <w:sz w:val="24"/>
           <w:lang w:val="es-GT"/>
         </w:rPr>
-        <w:t>dx</w:t>
-      </w:r>
-      <w:proofErr w:type="spellEnd"/>
-    </w:p>
-    <w:p>
-      <w:pPr>
-        <w:rPr>
-          <w:lang w:val="es-GT"/>
-        </w:rPr>
-      </w:pPr>
-      <w:r>
-        <w:rPr>
-          <w:lang w:val="es-GT"/>
-        </w:rPr>
-        <w:t>Se generan U y V independientes y uniformes en [0,1]. Como el área del cuadrado es 1, la integral es E[e^((U+</w:t>
-      </w:r>
-      <w:proofErr w:type="gramStart"/>
-      <w:r>
-        <w:rPr>
-          <w:lang w:val="es-GT"/>
-        </w:rPr>
-        <w:t>V)²</w:t>
-      </w:r>
-      <w:proofErr w:type="gramEnd"/>
-      <w:r>
-        <w:rPr>
-          <w:lang w:val="es-GT"/>
-        </w:rPr>
-        <w:t>)].</w:t>
-      </w:r>
-    </w:p>
-    <w:p>
-      <w:pPr>
-        <w:pStyle w:val="Heading2"/>
-        <w:spacing w:after="120"/>
-        <w:rPr>
-          <w:lang w:val="es-GT"/>
-        </w:rPr>
-      </w:pPr>
-      <w:r>
-        <w:rPr>
-          <w:lang w:val="es-GT"/>
-        </w:rPr>
-        <w:t>Inciso 9</w:t>
-      </w:r>
-    </w:p>
-    <w:p>
-      <w:pPr>
-        <w:jc w:val="center"/>
-        <w:rPr>
-          <w:lang w:val="es-GT"/>
-        </w:rPr>
-      </w:pPr>
+        <w:t>∫₀^∞ ∫₀ˣ e^(−(</w:t>
+      </w:r>
+      <w:proofErr w:type="spellStart"/>
       <w:r>
         <w:rPr>
           <w:rFonts w:ascii="Cambria Math" w:hAnsi="Cambria Math"/>
@@ -7440,9 +7356,9 @@
           <w:sz w:val="24"/>
           <w:lang w:val="es-GT"/>
         </w:rPr>
-        <w:t>∫₀^∞ ∫₀ˣ e^(−(</w:t>
-      </w:r>
-      <w:proofErr w:type="spellStart"/>
+        <w:t>x+y</w:t>
+      </w:r>
+      <w:proofErr w:type="spellEnd"/>
       <w:r>
         <w:rPr>
           <w:rFonts w:ascii="Cambria Math" w:hAnsi="Cambria Math"/>
@@ -7450,9 +7366,9 @@
           <w:sz w:val="24"/>
           <w:lang w:val="es-GT"/>
         </w:rPr>
-        <w:t>x+y</w:t>
-      </w:r>
-      <w:proofErr w:type="spellEnd"/>
+        <w:t xml:space="preserve">)) </w:t>
+      </w:r>
+      <w:proofErr w:type="spellStart"/>
       <w:r>
         <w:rPr>
           <w:rFonts w:ascii="Cambria Math" w:hAnsi="Cambria Math"/>
@@ -7460,9 +7376,9 @@
           <w:sz w:val="24"/>
           <w:lang w:val="es-GT"/>
         </w:rPr>
-        <w:t xml:space="preserve">)) </w:t>
-      </w:r>
-      <w:proofErr w:type="spellStart"/>
+        <w:t>dy</w:t>
+      </w:r>
+      <w:proofErr w:type="spellEnd"/>
       <w:r>
         <w:rPr>
           <w:rFonts w:ascii="Cambria Math" w:hAnsi="Cambria Math"/>
@@ -7470,9 +7386,9 @@
           <w:sz w:val="24"/>
           <w:lang w:val="es-GT"/>
         </w:rPr>
-        <w:t>dy</w:t>
-      </w:r>
-      <w:proofErr w:type="spellEnd"/>
+        <w:t xml:space="preserve"> </w:t>
+      </w:r>
+      <w:proofErr w:type="spellStart"/>
       <w:r>
         <w:rPr>
           <w:rFonts w:ascii="Cambria Math" w:hAnsi="Cambria Math"/>
@@ -7480,68 +7396,98 @@
           <w:sz w:val="24"/>
           <w:lang w:val="es-GT"/>
         </w:rPr>
-        <w:t xml:space="preserve"> </w:t>
+        <w:t>dx</w:t>
+      </w:r>
+      <w:proofErr w:type="spellEnd"/>
+    </w:p>
+    <w:p>
+      <w:pPr>
+        <w:rPr>
+          <w:lang w:val="es-GT"/>
+        </w:rPr>
+      </w:pPr>
+      <w:r>
+        <w:rPr>
+          <w:lang w:val="es-GT"/>
+        </w:rPr>
+        <w:t>La función e^(−x−y) es la densidad conjunta de dos exponenciales independientes de tasa 1. La integral representa P(Y&lt;X), estimada con el indicador 1 si Y&lt;X y 0 en otro caso.</w:t>
+      </w:r>
+    </w:p>
+    <w:p>
+      <w:pPr>
+        <w:rPr>
+          <w:lang w:val="es-GT"/>
+        </w:rPr>
+      </w:pPr>
+      <w:r>
+        <w:rPr>
+          <w:lang w:val="es-GT"/>
+        </w:rPr>
+        <w:drawing>
+          <wp:inline distT="0" distB="0" distL="0" distR="0" wp14:anchorId="17DDC344" wp14:editId="09D4B3B7">
+            <wp:extent cx="5732585" cy="2397563"/>
+            <wp:effectExtent l="0" t="0" r="1905" b="3175"/>
+            <wp:docPr id="1241308339" name="Picture 1"/>
+            <wp:cNvGraphicFramePr>
+              <a:graphicFrameLocks xmlns:a="http://schemas.openxmlformats.org/drawingml/2006/main" noChangeAspect="1"/>
+            </wp:cNvGraphicFramePr>
+            <a:graphic xmlns:a="http://schemas.openxmlformats.org/drawingml/2006/main">
+              <a:graphicData uri="http://schemas.openxmlformats.org/drawingml/2006/picture">
+                <pic:pic xmlns:pic="http://schemas.openxmlformats.org/drawingml/2006/picture">
+                  <pic:nvPicPr>
+                    <pic:cNvPr id="1241308339" name=""/>
+                    <pic:cNvPicPr/>
+                  </pic:nvPicPr>
+                  <pic:blipFill>
+                    <a:blip r:embed="rId19"/>
+                    <a:stretch>
+                      <a:fillRect/>
+                    </a:stretch>
+                  </pic:blipFill>
+                  <pic:spPr>
+                    <a:xfrm>
+                      <a:off x="0" y="0"/>
+                      <a:ext cx="5747008" cy="2403595"/>
+                    </a:xfrm>
+                    <a:prstGeom prst="rect">
+                      <a:avLst/>
+                    </a:prstGeom>
+                  </pic:spPr>
+                </pic:pic>
+              </a:graphicData>
+            </a:graphic>
+          </wp:inline>
+        </w:drawing>
+      </w:r>
+    </w:p>
+    <w:p>
+      <w:pPr>
+        <w:rPr>
+          <w:lang w:val="es-GT"/>
+        </w:rPr>
+      </w:pPr>
+    </w:p>
+    <w:p>
+      <w:pPr>
+        <w:jc w:val="both"/>
+        <w:rPr>
+          <w:lang w:val="es-GT"/>
+        </w:rPr>
+      </w:pPr>
+      <w:r>
+        <w:rPr>
+          <w:lang w:val="es-GT"/>
+        </w:rPr>
+        <w:t xml:space="preserve">las siete aproximaciones son cercanas a sus referencias. Los errores no son exactamente cero porque Monte Carlo es un método aleatorio; al aumentar la cantidad de muestras, el error típico disminuye aproximadamente en proporción a 1/√n. Los incisos 5 y 8 presentan mayor variabilidad porque sus </w:t>
       </w:r>
       <w:proofErr w:type="spellStart"/>
       <w:r>
         <w:rPr>
-          <w:rFonts w:ascii="Cambria Math" w:hAnsi="Cambria Math"/>
-          <w:b/>
-          <w:sz w:val="24"/>
-          <w:lang w:val="es-GT"/>
-        </w:rPr>
-        <w:t>dx</w:t>
+          <w:lang w:val="es-GT"/>
+        </w:rPr>
+        <w:t>integrandos</w:t>
       </w:r>
       <w:proofErr w:type="spellEnd"/>
-    </w:p>
-    <w:p>
-      <w:pPr>
-        <w:rPr>
-          <w:lang w:val="es-GT"/>
-        </w:rPr>
-      </w:pPr>
-      <w:r>
-        <w:rPr>
-          <w:lang w:val="es-GT"/>
-        </w:rPr>
-        <w:lastRenderedPageBreak/>
-        <w:t>La función e^(−x−y) es la densidad conjunta de dos exponenciales independientes de tasa 1. La integral representa P(Y&lt;X), estimada con el indicador 1 si Y&lt;X y 0 en otro caso.</w:t>
-      </w:r>
-    </w:p>
-    <w:p>
-      <w:pPr>
-        <w:rPr>
-          <w:lang w:val="es-GT"/>
-        </w:rPr>
-      </w:pPr>
-    </w:p>
-    <w:p>
-      <w:pPr>
-        <w:rPr>
-          <w:lang w:val="es-GT"/>
-        </w:rPr>
-      </w:pPr>
-    </w:p>
-    <w:p>
-      <w:pPr>
-        <w:rPr>
-          <w:lang w:val="es-GT"/>
-        </w:rPr>
-      </w:pPr>
-      <w:r>
-        <w:rPr>
-          <w:lang w:val="es-GT"/>
-        </w:rPr>
-        <w:t xml:space="preserve">las siete aproximaciones son cercanas a sus referencias. Los errores no son exactamente cero porque Monte Carlo es un método aleatorio; al aumentar la cantidad de muestras, el error típico disminuye aproximadamente en proporción a 1/√n. Los incisos 5 y 8 presentan mayor variabilidad porque sus </w:t>
-      </w:r>
-      <w:proofErr w:type="spellStart"/>
-      <w:r>
-        <w:rPr>
-          <w:lang w:val="es-GT"/>
-        </w:rPr>
-        <w:t>integrandos</w:t>
-      </w:r>
-      <w:proofErr w:type="spellEnd"/>
       <w:r>
         <w:rPr>
           <w:lang w:val="es-GT"/>
@@ -7550,12 +7496,12 @@
       </w:r>
     </w:p>
     <w:sectPr>
-      <w:headerReference w:type="even" r:id="rId19"/>
-      <w:headerReference w:type="default" r:id="rId20"/>
-      <w:footerReference w:type="even" r:id="rId21"/>
-      <w:footerReference w:type="default" r:id="rId22"/>
-      <w:headerReference w:type="first" r:id="rId23"/>
-      <w:footerReference w:type="first" r:id="rId24"/>
+      <w:headerReference w:type="even" r:id="rId20"/>
+      <w:headerReference w:type="default" r:id="rId21"/>
+      <w:footerReference w:type="even" r:id="rId22"/>
+      <w:footerReference w:type="default" r:id="rId23"/>
+      <w:headerReference w:type="first" r:id="rId24"/>
+      <w:footerReference w:type="first" r:id="rId25"/>
       <w:pgSz w:w="12240" w:h="15840"/>
       <w:pgMar w:top="2760" w:right="1417" w:bottom="1777" w:left="1417" w:header="1179" w:footer="1257" w:gutter="0"/>
       <w:cols w:space="720"/>
@@ -8671,12 +8617,14 @@
     <w:rPrDefault>
       <w:rPr>
         <w:rFonts w:asciiTheme="minorHAnsi" w:eastAsiaTheme="minorEastAsia" w:hAnsiTheme="minorHAnsi" w:cstheme="minorBidi"/>
+        <w:sz w:val="21"/>
+        <w:szCs w:val="21"/>
         <w:lang w:val="en-US" w:eastAsia="en-US" w:bidi="ar-SA"/>
       </w:rPr>
     </w:rPrDefault>
     <w:pPrDefault>
       <w:pPr>
-        <w:spacing w:after="120" w:line="264" w:lineRule="auto"/>
+        <w:spacing w:after="160" w:line="300" w:lineRule="auto"/>
       </w:pPr>
     </w:pPrDefault>
   </w:docDefaults>
@@ -9061,7 +9009,7 @@
   <w:style w:type="paragraph" w:default="1" w:styleId="Normal">
     <w:name w:val="Normal"/>
     <w:qFormat/>
-    <w:rsid w:val="007D36EE"/>
+    <w:rsid w:val="00117806"/>
   </w:style>
   <w:style w:type="paragraph" w:styleId="Heading1">
     <w:name w:val="heading 1"/>
@@ -9070,18 +9018,19 @@
     <w:link w:val="Heading1Char"/>
     <w:uiPriority w:val="9"/>
     <w:qFormat/>
-    <w:rsid w:val="007D36EE"/>
+    <w:rsid w:val="00117806"/>
     <w:pPr>
       <w:keepNext/>
       <w:keepLines/>
-      <w:spacing w:before="320" w:after="0" w:line="240" w:lineRule="auto"/>
+      <w:spacing w:before="320" w:after="80" w:line="240" w:lineRule="auto"/>
+      <w:jc w:val="center"/>
       <w:outlineLvl w:val="0"/>
     </w:pPr>
     <w:rPr>
       <w:rFonts w:asciiTheme="majorHAnsi" w:eastAsiaTheme="majorEastAsia" w:hAnsiTheme="majorHAnsi" w:cstheme="majorBidi"/>
-      <w:color w:val="1F4E79"/>
-      <w:sz w:val="32"/>
-      <w:szCs w:val="32"/>
+      <w:color w:val="0F4761" w:themeColor="accent1" w:themeShade="BF"/>
+      <w:sz w:val="40"/>
+      <w:szCs w:val="40"/>
     </w:rPr>
   </w:style>
   <w:style w:type="paragraph" w:styleId="Heading2">
@@ -9093,18 +9042,18 @@
     <w:semiHidden/>
     <w:unhideWhenUsed/>
     <w:qFormat/>
-    <w:rsid w:val="007D36EE"/>
+    <w:rsid w:val="00117806"/>
     <w:pPr>
       <w:keepNext/>
       <w:keepLines/>
-      <w:spacing w:before="80" w:after="0" w:line="240" w:lineRule="auto"/>
+      <w:spacing w:before="160" w:after="40" w:line="240" w:lineRule="auto"/>
+      <w:jc w:val="center"/>
       <w:outlineLvl w:val="1"/>
     </w:pPr>
     <w:rPr>
       <w:rFonts w:asciiTheme="majorHAnsi" w:eastAsiaTheme="majorEastAsia" w:hAnsiTheme="majorHAnsi" w:cstheme="majorBidi"/>
-      <w:color w:val="1F4E79"/>
-      <w:sz w:val="28"/>
-      <w:szCs w:val="28"/>
+      <w:sz w:val="32"/>
+      <w:szCs w:val="32"/>
     </w:rPr>
   </w:style>
   <w:style w:type="paragraph" w:styleId="Heading3">
@@ -9116,18 +9065,17 @@
     <w:semiHidden/>
     <w:unhideWhenUsed/>
     <w:qFormat/>
-    <w:rsid w:val="007D36EE"/>
+    <w:rsid w:val="00117806"/>
     <w:pPr>
       <w:keepNext/>
       <w:keepLines/>
-      <w:spacing w:before="40" w:after="0" w:line="240" w:lineRule="auto"/>
+      <w:spacing w:before="160" w:after="0" w:line="240" w:lineRule="auto"/>
       <w:outlineLvl w:val="2"/>
     </w:pPr>
     <w:rPr>
       <w:rFonts w:asciiTheme="majorHAnsi" w:eastAsiaTheme="majorEastAsia" w:hAnsiTheme="majorHAnsi" w:cstheme="majorBidi"/>
-      <w:color w:val="0E2841" w:themeColor="text2"/>
-      <w:sz w:val="24"/>
-      <w:szCs w:val="24"/>
+      <w:sz w:val="32"/>
+      <w:szCs w:val="32"/>
     </w:rPr>
   </w:style>
   <w:style w:type="paragraph" w:styleId="Heading4">
@@ -9139,17 +9087,19 @@
     <w:semiHidden/>
     <w:unhideWhenUsed/>
     <w:qFormat/>
-    <w:rsid w:val="007D36EE"/>
+    <w:rsid w:val="00117806"/>
     <w:pPr>
       <w:keepNext/>
       <w:keepLines/>
-      <w:spacing w:before="40" w:after="0"/>
+      <w:spacing w:before="80" w:after="0"/>
       <w:outlineLvl w:val="3"/>
     </w:pPr>
     <w:rPr>
       <w:rFonts w:asciiTheme="majorHAnsi" w:eastAsiaTheme="majorEastAsia" w:hAnsiTheme="majorHAnsi" w:cstheme="majorBidi"/>
-      <w:sz w:val="22"/>
-      <w:szCs w:val="22"/>
+      <w:i/>
+      <w:iCs/>
+      <w:sz w:val="30"/>
+      <w:szCs w:val="30"/>
     </w:rPr>
   </w:style>
   <w:style w:type="paragraph" w:styleId="Heading5">
@@ -9161,7 +9111,7 @@
     <w:semiHidden/>
     <w:unhideWhenUsed/>
     <w:qFormat/>
-    <w:rsid w:val="007D36EE"/>
+    <w:rsid w:val="00117806"/>
     <w:pPr>
       <w:keepNext/>
       <w:keepLines/>
@@ -9170,9 +9120,8 @@
     </w:pPr>
     <w:rPr>
       <w:rFonts w:asciiTheme="majorHAnsi" w:eastAsiaTheme="majorEastAsia" w:hAnsiTheme="majorHAnsi" w:cstheme="majorBidi"/>
-      <w:color w:val="0E2841" w:themeColor="text2"/>
-      <w:sz w:val="22"/>
-      <w:szCs w:val="22"/>
+      <w:sz w:val="28"/>
+      <w:szCs w:val="28"/>
     </w:rPr>
   </w:style>
   <w:style w:type="paragraph" w:styleId="Heading6">
@@ -9184,7 +9133,7 @@
     <w:semiHidden/>
     <w:unhideWhenUsed/>
     <w:qFormat/>
-    <w:rsid w:val="007D36EE"/>
+    <w:rsid w:val="00117806"/>
     <w:pPr>
       <w:keepNext/>
       <w:keepLines/>
@@ -9195,9 +9144,8 @@
       <w:rFonts w:asciiTheme="majorHAnsi" w:eastAsiaTheme="majorEastAsia" w:hAnsiTheme="majorHAnsi" w:cstheme="majorBidi"/>
       <w:i/>
       <w:iCs/>
-      <w:color w:val="0E2841" w:themeColor="text2"/>
-      <w:sz w:val="21"/>
-      <w:szCs w:val="21"/>
+      <w:sz w:val="26"/>
+      <w:szCs w:val="26"/>
     </w:rPr>
   </w:style>
   <w:style w:type="paragraph" w:styleId="Heading7">
@@ -9209,7 +9157,7 @@
     <w:semiHidden/>
     <w:unhideWhenUsed/>
     <w:qFormat/>
-    <w:rsid w:val="007D36EE"/>
+    <w:rsid w:val="00117806"/>
     <w:pPr>
       <w:keepNext/>
       <w:keepLines/>
@@ -9218,11 +9166,8 @@
     </w:pPr>
     <w:rPr>
       <w:rFonts w:asciiTheme="majorHAnsi" w:eastAsiaTheme="majorEastAsia" w:hAnsiTheme="majorHAnsi" w:cstheme="majorBidi"/>
-      <w:i/>
-      <w:iCs/>
-      <w:color w:val="0A2F41" w:themeColor="accent1" w:themeShade="80"/>
-      <w:sz w:val="21"/>
-      <w:szCs w:val="21"/>
+      <w:sz w:val="24"/>
+      <w:szCs w:val="24"/>
     </w:rPr>
   </w:style>
   <w:style w:type="paragraph" w:styleId="Heading8">
@@ -9234,7 +9179,7 @@
     <w:semiHidden/>
     <w:unhideWhenUsed/>
     <w:qFormat/>
-    <w:rsid w:val="007D36EE"/>
+    <w:rsid w:val="00117806"/>
     <w:pPr>
       <w:keepNext/>
       <w:keepLines/>
@@ -9243,9 +9188,10 @@
     </w:pPr>
     <w:rPr>
       <w:rFonts w:asciiTheme="majorHAnsi" w:eastAsiaTheme="majorEastAsia" w:hAnsiTheme="majorHAnsi" w:cstheme="majorBidi"/>
-      <w:b/>
-      <w:bCs/>
-      <w:color w:val="0E2841" w:themeColor="text2"/>
+      <w:i/>
+      <w:iCs/>
+      <w:sz w:val="22"/>
+      <w:szCs w:val="22"/>
     </w:rPr>
   </w:style>
   <w:style w:type="paragraph" w:styleId="Heading9">
@@ -9257,7 +9203,7 @@
     <w:semiHidden/>
     <w:unhideWhenUsed/>
     <w:qFormat/>
-    <w:rsid w:val="007D36EE"/>
+    <w:rsid w:val="00117806"/>
     <w:pPr>
       <w:keepNext/>
       <w:keepLines/>
@@ -9265,12 +9211,10 @@
       <w:outlineLvl w:val="8"/>
     </w:pPr>
     <w:rPr>
-      <w:rFonts w:asciiTheme="majorHAnsi" w:eastAsiaTheme="majorEastAsia" w:hAnsiTheme="majorHAnsi" w:cstheme="majorBidi"/>
       <w:b/>
       <w:bCs/>
       <w:i/>
       <w:iCs/>
-      <w:color w:val="0E2841" w:themeColor="text2"/>
     </w:rPr>
   </w:style>
   <w:style w:type="character" w:default="1" w:styleId="DefaultParagraphFont">
@@ -9305,12 +9249,12 @@
     <w:basedOn w:val="DefaultParagraphFont"/>
     <w:link w:val="Heading1"/>
     <w:uiPriority w:val="9"/>
-    <w:rsid w:val="007D36EE"/>
+    <w:rsid w:val="00117806"/>
     <w:rPr>
       <w:rFonts w:asciiTheme="majorHAnsi" w:eastAsiaTheme="majorEastAsia" w:hAnsiTheme="majorHAnsi" w:cstheme="majorBidi"/>
       <w:color w:val="0F4761" w:themeColor="accent1" w:themeShade="BF"/>
-      <w:sz w:val="32"/>
-      <w:szCs w:val="32"/>
+      <w:sz w:val="40"/>
+      <w:szCs w:val="40"/>
     </w:rPr>
   </w:style>
   <w:style w:type="table" w:customStyle="1" w:styleId="TableGrid">
@@ -9352,12 +9296,11 @@
     <w:link w:val="Heading2"/>
     <w:uiPriority w:val="9"/>
     <w:semiHidden/>
-    <w:rsid w:val="007D36EE"/>
+    <w:rsid w:val="00117806"/>
     <w:rPr>
       <w:rFonts w:asciiTheme="majorHAnsi" w:eastAsiaTheme="majorEastAsia" w:hAnsiTheme="majorHAnsi" w:cstheme="majorBidi"/>
-      <w:color w:val="404040" w:themeColor="text1" w:themeTint="BF"/>
-      <w:sz w:val="28"/>
-      <w:szCs w:val="28"/>
+      <w:sz w:val="32"/>
+      <w:szCs w:val="32"/>
     </w:rPr>
   </w:style>
   <w:style w:type="character" w:customStyle="1" w:styleId="Heading3Char">
@@ -9366,12 +9309,11 @@
     <w:link w:val="Heading3"/>
     <w:uiPriority w:val="9"/>
     <w:semiHidden/>
-    <w:rsid w:val="007D36EE"/>
+    <w:rsid w:val="00117806"/>
     <w:rPr>
       <w:rFonts w:asciiTheme="majorHAnsi" w:eastAsiaTheme="majorEastAsia" w:hAnsiTheme="majorHAnsi" w:cstheme="majorBidi"/>
-      <w:color w:val="0E2841" w:themeColor="text2"/>
-      <w:sz w:val="24"/>
-      <w:szCs w:val="24"/>
+      <w:sz w:val="32"/>
+      <w:szCs w:val="32"/>
     </w:rPr>
   </w:style>
   <w:style w:type="character" w:customStyle="1" w:styleId="Heading4Char">
@@ -9380,11 +9322,13 @@
     <w:link w:val="Heading4"/>
     <w:uiPriority w:val="9"/>
     <w:semiHidden/>
-    <w:rsid w:val="007D36EE"/>
+    <w:rsid w:val="00117806"/>
     <w:rPr>
       <w:rFonts w:asciiTheme="majorHAnsi" w:eastAsiaTheme="majorEastAsia" w:hAnsiTheme="majorHAnsi" w:cstheme="majorBidi"/>
-      <w:sz w:val="22"/>
-      <w:szCs w:val="22"/>
+      <w:i/>
+      <w:iCs/>
+      <w:sz w:val="30"/>
+      <w:szCs w:val="30"/>
     </w:rPr>
   </w:style>
   <w:style w:type="character" w:customStyle="1" w:styleId="Heading5Char">
@@ -9393,12 +9337,11 @@
     <w:link w:val="Heading5"/>
     <w:uiPriority w:val="9"/>
     <w:semiHidden/>
-    <w:rsid w:val="007D36EE"/>
+    <w:rsid w:val="00117806"/>
     <w:rPr>
       <w:rFonts w:asciiTheme="majorHAnsi" w:eastAsiaTheme="majorEastAsia" w:hAnsiTheme="majorHAnsi" w:cstheme="majorBidi"/>
-      <w:color w:val="0E2841" w:themeColor="text2"/>
-      <w:sz w:val="22"/>
-      <w:szCs w:val="22"/>
+      <w:sz w:val="28"/>
+      <w:szCs w:val="28"/>
     </w:rPr>
   </w:style>
   <w:style w:type="character" w:customStyle="1" w:styleId="Heading6Char">
@@ -9407,14 +9350,13 @@
     <w:link w:val="Heading6"/>
     <w:uiPriority w:val="9"/>
     <w:semiHidden/>
-    <w:rsid w:val="007D36EE"/>
+    <w:rsid w:val="00117806"/>
     <w:rPr>
       <w:rFonts w:asciiTheme="majorHAnsi" w:eastAsiaTheme="majorEastAsia" w:hAnsiTheme="majorHAnsi" w:cstheme="majorBidi"/>
       <w:i/>
       <w:iCs/>
-      <w:color w:val="0E2841" w:themeColor="text2"/>
-      <w:sz w:val="21"/>
-      <w:szCs w:val="21"/>
+      <w:sz w:val="26"/>
+      <w:szCs w:val="26"/>
     </w:rPr>
   </w:style>
   <w:style w:type="character" w:customStyle="1" w:styleId="Heading7Char">
@@ -9423,14 +9365,11 @@
     <w:link w:val="Heading7"/>
     <w:uiPriority w:val="9"/>
     <w:semiHidden/>
-    <w:rsid w:val="007D36EE"/>
+    <w:rsid w:val="00117806"/>
     <w:rPr>
       <w:rFonts w:asciiTheme="majorHAnsi" w:eastAsiaTheme="majorEastAsia" w:hAnsiTheme="majorHAnsi" w:cstheme="majorBidi"/>
-      <w:i/>
-      <w:iCs/>
-      <w:color w:val="0A2F41" w:themeColor="accent1" w:themeShade="80"/>
-      <w:sz w:val="21"/>
-      <w:szCs w:val="21"/>
+      <w:sz w:val="24"/>
+      <w:szCs w:val="24"/>
     </w:rPr>
   </w:style>
   <w:style w:type="character" w:customStyle="1" w:styleId="Heading8Char">
@@ -9439,12 +9378,13 @@
     <w:link w:val="Heading8"/>
     <w:uiPriority w:val="9"/>
     <w:semiHidden/>
-    <w:rsid w:val="007D36EE"/>
+    <w:rsid w:val="00117806"/>
     <w:rPr>
       <w:rFonts w:asciiTheme="majorHAnsi" w:eastAsiaTheme="majorEastAsia" w:hAnsiTheme="majorHAnsi" w:cstheme="majorBidi"/>
-      <w:b/>
-      <w:bCs/>
-      <w:color w:val="0E2841" w:themeColor="text2"/>
+      <w:i/>
+      <w:iCs/>
+      <w:sz w:val="22"/>
+      <w:szCs w:val="22"/>
     </w:rPr>
   </w:style>
   <w:style w:type="character" w:customStyle="1" w:styleId="Heading9Char">
@@ -9453,14 +9393,12 @@
     <w:link w:val="Heading9"/>
     <w:uiPriority w:val="9"/>
     <w:semiHidden/>
-    <w:rsid w:val="007D36EE"/>
+    <w:rsid w:val="00117806"/>
     <w:rPr>
-      <w:rFonts w:asciiTheme="majorHAnsi" w:eastAsiaTheme="majorEastAsia" w:hAnsiTheme="majorHAnsi" w:cstheme="majorBidi"/>
       <w:b/>
       <w:bCs/>
       <w:i/>
       <w:iCs/>
-      <w:color w:val="0E2841" w:themeColor="text2"/>
     </w:rPr>
   </w:style>
   <w:style w:type="paragraph" w:styleId="Caption">
@@ -9471,16 +9409,16 @@
     <w:semiHidden/>
     <w:unhideWhenUsed/>
     <w:qFormat/>
-    <w:rsid w:val="007D36EE"/>
+    <w:rsid w:val="00117806"/>
     <w:pPr>
       <w:spacing w:line="240" w:lineRule="auto"/>
     </w:pPr>
     <w:rPr>
       <w:b/>
       <w:bCs/>
-      <w:smallCaps/>
-      <w:color w:val="595959" w:themeColor="text1" w:themeTint="A6"/>
-      <w:spacing w:val="6"/>
+      <w:color w:val="404040" w:themeColor="text1" w:themeTint="BF"/>
+      <w:sz w:val="16"/>
+      <w:szCs w:val="16"/>
     </w:rPr>
   </w:style>
   <w:style w:type="paragraph" w:styleId="Title">
@@ -9490,17 +9428,23 @@
     <w:link w:val="TitleChar"/>
     <w:uiPriority w:val="10"/>
     <w:qFormat/>
-    <w:rsid w:val="007D36EE"/>
+    <w:rsid w:val="00117806"/>
     <w:pPr>
-      <w:spacing w:after="0" w:line="240" w:lineRule="auto"/>
+      <w:pBdr>
+        <w:top w:val="single" w:sz="6" w:space="8" w:color="196B24" w:themeColor="accent3"/>
+        <w:bottom w:val="single" w:sz="6" w:space="8" w:color="196B24" w:themeColor="accent3"/>
+      </w:pBdr>
+      <w:spacing w:after="400" w:line="240" w:lineRule="auto"/>
       <w:contextualSpacing/>
+      <w:jc w:val="center"/>
     </w:pPr>
     <w:rPr>
       <w:rFonts w:asciiTheme="majorHAnsi" w:eastAsiaTheme="majorEastAsia" w:hAnsiTheme="majorHAnsi" w:cstheme="majorBidi"/>
-      <w:color w:val="156082" w:themeColor="accent1"/>
-      <w:spacing w:val="-10"/>
-      <w:sz w:val="56"/>
-      <w:szCs w:val="56"/>
+      <w:caps/>
+      <w:color w:val="0E2841" w:themeColor="text2"/>
+      <w:spacing w:val="30"/>
+      <w:sz w:val="72"/>
+      <w:szCs w:val="72"/>
     </w:rPr>
   </w:style>
   <w:style w:type="character" w:customStyle="1" w:styleId="TitleChar">
@@ -9508,13 +9452,14 @@
     <w:basedOn w:val="DefaultParagraphFont"/>
     <w:link w:val="Title"/>
     <w:uiPriority w:val="10"/>
-    <w:rsid w:val="007D36EE"/>
+    <w:rsid w:val="00117806"/>
     <w:rPr>
       <w:rFonts w:asciiTheme="majorHAnsi" w:eastAsiaTheme="majorEastAsia" w:hAnsiTheme="majorHAnsi" w:cstheme="majorBidi"/>
-      <w:color w:val="156082" w:themeColor="accent1"/>
-      <w:spacing w:val="-10"/>
-      <w:sz w:val="56"/>
-      <w:szCs w:val="56"/>
+      <w:caps/>
+      <w:color w:val="0E2841" w:themeColor="text2"/>
+      <w:spacing w:val="30"/>
+      <w:sz w:val="72"/>
+      <w:szCs w:val="72"/>
     </w:rPr>
   </w:style>
   <w:style w:type="paragraph" w:styleId="Subtitle">
@@ -9524,17 +9469,17 @@
     <w:link w:val="SubtitleChar"/>
     <w:uiPriority w:val="11"/>
     <w:qFormat/>
-    <w:rsid w:val="007D36EE"/>
+    <w:rsid w:val="00117806"/>
     <w:pPr>
       <w:numPr>
         <w:ilvl w:val="1"/>
       </w:numPr>
-      <w:spacing w:line="240" w:lineRule="auto"/>
+      <w:jc w:val="center"/>
     </w:pPr>
     <w:rPr>
-      <w:rFonts w:asciiTheme="majorHAnsi" w:eastAsiaTheme="majorEastAsia" w:hAnsiTheme="majorHAnsi" w:cstheme="majorBidi"/>
-      <w:sz w:val="24"/>
-      <w:szCs w:val="24"/>
+      <w:color w:val="0E2841" w:themeColor="text2"/>
+      <w:sz w:val="28"/>
+      <w:szCs w:val="28"/>
     </w:rPr>
   </w:style>
   <w:style w:type="character" w:customStyle="1" w:styleId="SubtitleChar">
@@ -9542,11 +9487,11 @@
     <w:basedOn w:val="DefaultParagraphFont"/>
     <w:link w:val="Subtitle"/>
     <w:uiPriority w:val="11"/>
-    <w:rsid w:val="007D36EE"/>
+    <w:rsid w:val="00117806"/>
     <w:rPr>
-      <w:rFonts w:asciiTheme="majorHAnsi" w:eastAsiaTheme="majorEastAsia" w:hAnsiTheme="majorHAnsi" w:cstheme="majorBidi"/>
-      <w:sz w:val="24"/>
-      <w:szCs w:val="24"/>
+      <w:color w:val="0E2841" w:themeColor="text2"/>
+      <w:sz w:val="28"/>
+      <w:szCs w:val="28"/>
     </w:rPr>
   </w:style>
   <w:style w:type="character" w:styleId="Strong">
@@ -9554,7 +9499,7 @@
     <w:basedOn w:val="DefaultParagraphFont"/>
     <w:uiPriority w:val="22"/>
     <w:qFormat/>
-    <w:rsid w:val="007D36EE"/>
+    <w:rsid w:val="00117806"/>
     <w:rPr>
       <w:b/>
       <w:bCs/>
@@ -9565,17 +9510,18 @@
     <w:basedOn w:val="DefaultParagraphFont"/>
     <w:uiPriority w:val="20"/>
     <w:qFormat/>
-    <w:rsid w:val="007D36EE"/>
+    <w:rsid w:val="00117806"/>
     <w:rPr>
       <w:i/>
       <w:iCs/>
+      <w:color w:val="000000" w:themeColor="text1"/>
     </w:rPr>
   </w:style>
   <w:style w:type="paragraph" w:styleId="NoSpacing">
     <w:name w:val="No Spacing"/>
     <w:uiPriority w:val="1"/>
     <w:qFormat/>
-    <w:rsid w:val="007D36EE"/>
+    <w:rsid w:val="00117806"/>
     <w:pPr>
       <w:spacing w:after="0" w:line="240" w:lineRule="auto"/>
     </w:pPr>
@@ -9587,15 +9533,18 @@
     <w:link w:val="QuoteChar"/>
     <w:uiPriority w:val="29"/>
     <w:qFormat/>
-    <w:rsid w:val="007D36EE"/>
+    <w:rsid w:val="00117806"/>
     <w:pPr>
       <w:spacing w:before="160"/>
       <w:ind w:left="720" w:right="720"/>
+      <w:jc w:val="center"/>
     </w:pPr>
     <w:rPr>
       <w:i/>
       <w:iCs/>
-      <w:color w:val="404040" w:themeColor="text1" w:themeTint="BF"/>
+      <w:color w:val="124F1A" w:themeColor="accent3" w:themeShade="BF"/>
+      <w:sz w:val="24"/>
+      <w:szCs w:val="24"/>
     </w:rPr>
   </w:style>
   <w:style w:type="character" w:customStyle="1" w:styleId="QuoteChar">
@@ -9603,11 +9552,13 @@
     <w:basedOn w:val="DefaultParagraphFont"/>
     <w:link w:val="Quote"/>
     <w:uiPriority w:val="29"/>
-    <w:rsid w:val="007D36EE"/>
+    <w:rsid w:val="00117806"/>
     <w:rPr>
       <w:i/>
       <w:iCs/>
-      <w:color w:val="404040" w:themeColor="text1" w:themeTint="BF"/>
+      <w:color w:val="124F1A" w:themeColor="accent3" w:themeShade="BF"/>
+      <w:sz w:val="24"/>
+      <w:szCs w:val="24"/>
     </w:rPr>
   </w:style>
   <w:style w:type="paragraph" w:styleId="IntenseQuote">
@@ -9617,17 +9568,16 @@
     <w:link w:val="IntenseQuoteChar"/>
     <w:uiPriority w:val="30"/>
     <w:qFormat/>
-    <w:rsid w:val="007D36EE"/>
+    <w:rsid w:val="00117806"/>
     <w:pPr>
-      <w:pBdr>
-        <w:left w:val="single" w:sz="18" w:space="12" w:color="156082" w:themeColor="accent1"/>
-      </w:pBdr>
-      <w:spacing w:before="100" w:beforeAutospacing="1" w:line="300" w:lineRule="auto"/>
-      <w:ind w:left="1224" w:right="1224"/>
+      <w:spacing w:before="160" w:line="276" w:lineRule="auto"/>
+      <w:ind w:left="936" w:right="936"/>
+      <w:jc w:val="center"/>
     </w:pPr>
     <w:rPr>
       <w:rFonts w:asciiTheme="majorHAnsi" w:eastAsiaTheme="majorEastAsia" w:hAnsiTheme="majorHAnsi" w:cstheme="majorBidi"/>
-      <w:color w:val="156082" w:themeColor="accent1"/>
+      <w:caps/>
+      <w:color w:val="0F4761" w:themeColor="accent1" w:themeShade="BF"/>
       <w:sz w:val="28"/>
       <w:szCs w:val="28"/>
     </w:rPr>
@@ -9637,10 +9587,11 @@
     <w:basedOn w:val="DefaultParagraphFont"/>
     <w:link w:val="IntenseQuote"/>
     <w:uiPriority w:val="30"/>
-    <w:rsid w:val="007D36EE"/>
+    <w:rsid w:val="00117806"/>
     <w:rPr>
       <w:rFonts w:asciiTheme="majorHAnsi" w:eastAsiaTheme="majorEastAsia" w:hAnsiTheme="majorHAnsi" w:cstheme="majorBidi"/>
-      <w:color w:val="156082" w:themeColor="accent1"/>
+      <w:caps/>
+      <w:color w:val="0F4761" w:themeColor="accent1" w:themeShade="BF"/>
       <w:sz w:val="28"/>
       <w:szCs w:val="28"/>
     </w:rPr>
@@ -9650,11 +9601,11 @@
     <w:basedOn w:val="DefaultParagraphFont"/>
     <w:uiPriority w:val="19"/>
     <w:qFormat/>
-    <w:rsid w:val="007D36EE"/>
+    <w:rsid w:val="00117806"/>
     <w:rPr>
       <w:i/>
       <w:iCs/>
-      <w:color w:val="404040" w:themeColor="text1" w:themeTint="BF"/>
+      <w:color w:val="595959" w:themeColor="text1" w:themeTint="A6"/>
     </w:rPr>
   </w:style>
   <w:style w:type="character" w:styleId="IntenseEmphasis">
@@ -9662,12 +9613,13 @@
     <w:basedOn w:val="DefaultParagraphFont"/>
     <w:uiPriority w:val="21"/>
     <w:qFormat/>
-    <w:rsid w:val="007D36EE"/>
+    <w:rsid w:val="00117806"/>
     <w:rPr>
       <w:b/>
       <w:bCs/>
       <w:i/>
       <w:iCs/>
+      <w:color w:val="auto"/>
     </w:rPr>
   </w:style>
   <w:style w:type="character" w:styleId="SubtleReference">
@@ -9675,10 +9627,12 @@
     <w:basedOn w:val="DefaultParagraphFont"/>
     <w:uiPriority w:val="31"/>
     <w:qFormat/>
-    <w:rsid w:val="007D36EE"/>
+    <w:rsid w:val="00117806"/>
     <w:rPr>
+      <w:caps w:val="0"/>
       <w:smallCaps/>
       <w:color w:val="404040" w:themeColor="text1" w:themeTint="BF"/>
+      <w:spacing w:val="0"/>
       <w:u w:val="single" w:color="7F7F7F" w:themeColor="text1" w:themeTint="80"/>
     </w:rPr>
   </w:style>
@@ -9687,12 +9641,14 @@
     <w:basedOn w:val="DefaultParagraphFont"/>
     <w:uiPriority w:val="32"/>
     <w:qFormat/>
-    <w:rsid w:val="007D36EE"/>
+    <w:rsid w:val="00117806"/>
     <w:rPr>
       <w:b/>
       <w:bCs/>
+      <w:caps w:val="0"/>
       <w:smallCaps/>
-      <w:spacing w:val="5"/>
+      <w:color w:val="auto"/>
+      <w:spacing w:val="0"/>
       <w:u w:val="single"/>
     </w:rPr>
   </w:style>
@@ -9701,11 +9657,13 @@
     <w:basedOn w:val="DefaultParagraphFont"/>
     <w:uiPriority w:val="33"/>
     <w:qFormat/>
-    <w:rsid w:val="007D36EE"/>
+    <w:rsid w:val="00117806"/>
     <w:rPr>
       <w:b/>
       <w:bCs/>
+      <w:caps w:val="0"/>
       <w:smallCaps/>
+      <w:spacing w:val="0"/>
     </w:rPr>
   </w:style>
   <w:style w:type="paragraph" w:styleId="TOCHeading">
@@ -9716,7 +9674,7 @@
     <w:semiHidden/>
     <w:unhideWhenUsed/>
     <w:qFormat/>
-    <w:rsid w:val="007D36EE"/>
+    <w:rsid w:val="00117806"/>
     <w:pPr>
       <w:outlineLvl w:val="9"/>
     </w:pPr>
@@ -9731,6 +9689,186 @@
       <w:ind w:left="720"/>
       <w:contextualSpacing/>
     </w:pPr>
+  </w:style>
+  <w:style w:type="table" w:styleId="ListTable4-Accent3">
+    <w:name w:val="List Table 4 Accent 3"/>
+    <w:basedOn w:val="TableNormal"/>
+    <w:uiPriority w:val="49"/>
+    <w:rsid w:val="00117806"/>
+    <w:pPr>
+      <w:spacing w:after="0" w:line="240" w:lineRule="auto"/>
+    </w:pPr>
+    <w:tblPr>
+      <w:tblStyleRowBandSize w:val="1"/>
+      <w:tblStyleColBandSize w:val="1"/>
+      <w:tblBorders>
+        <w:top w:val="single" w:sz="4" w:space="0" w:color="47D459" w:themeColor="accent3" w:themeTint="99"/>
+        <w:left w:val="single" w:sz="4" w:space="0" w:color="47D459" w:themeColor="accent3" w:themeTint="99"/>
+        <w:bottom w:val="single" w:sz="4" w:space="0" w:color="47D459" w:themeColor="accent3" w:themeTint="99"/>
+        <w:right w:val="single" w:sz="4" w:space="0" w:color="47D459" w:themeColor="accent3" w:themeTint="99"/>
+        <w:insideH w:val="single" w:sz="4" w:space="0" w:color="47D459" w:themeColor="accent3" w:themeTint="99"/>
+      </w:tblBorders>
+    </w:tblPr>
+    <w:tblStylePr w:type="firstRow">
+      <w:rPr>
+        <w:b/>
+        <w:bCs/>
+        <w:color w:val="FFFFFF" w:themeColor="background1"/>
+      </w:rPr>
+      <w:tblPr/>
+      <w:tcPr>
+        <w:tcBorders>
+          <w:top w:val="single" w:sz="4" w:space="0" w:color="196B24" w:themeColor="accent3"/>
+          <w:left w:val="single" w:sz="4" w:space="0" w:color="196B24" w:themeColor="accent3"/>
+          <w:bottom w:val="single" w:sz="4" w:space="0" w:color="196B24" w:themeColor="accent3"/>
+          <w:right w:val="single" w:sz="4" w:space="0" w:color="196B24" w:themeColor="accent3"/>
+          <w:insideH w:val="nil"/>
+        </w:tcBorders>
+        <w:shd w:val="clear" w:color="auto" w:fill="196B24" w:themeFill="accent3"/>
+      </w:tcPr>
+    </w:tblStylePr>
+    <w:tblStylePr w:type="lastRow">
+      <w:rPr>
+        <w:b/>
+        <w:bCs/>
+      </w:rPr>
+      <w:tblPr/>
+      <w:tcPr>
+        <w:tcBorders>
+          <w:top w:val="double" w:sz="4" w:space="0" w:color="47D459" w:themeColor="accent3" w:themeTint="99"/>
+        </w:tcBorders>
+      </w:tcPr>
+    </w:tblStylePr>
+    <w:tblStylePr w:type="firstCol">
+      <w:rPr>
+        <w:b/>
+        <w:bCs/>
+      </w:rPr>
+    </w:tblStylePr>
+    <w:tblStylePr w:type="lastCol">
+      <w:rPr>
+        <w:b/>
+        <w:bCs/>
+      </w:rPr>
+    </w:tblStylePr>
+    <w:tblStylePr w:type="band1Vert">
+      <w:tblPr/>
+      <w:tcPr>
+        <w:shd w:val="clear" w:color="auto" w:fill="C1F0C7" w:themeFill="accent3" w:themeFillTint="33"/>
+      </w:tcPr>
+    </w:tblStylePr>
+    <w:tblStylePr w:type="band1Horz">
+      <w:tblPr/>
+      <w:tcPr>
+        <w:shd w:val="clear" w:color="auto" w:fill="C1F0C7" w:themeFill="accent3" w:themeFillTint="33"/>
+      </w:tcPr>
+    </w:tblStylePr>
+  </w:style>
+  <w:style w:type="table" w:styleId="GridTable5Dark-Accent3">
+    <w:name w:val="Grid Table 5 Dark Accent 3"/>
+    <w:basedOn w:val="TableNormal"/>
+    <w:uiPriority w:val="50"/>
+    <w:rsid w:val="00117806"/>
+    <w:pPr>
+      <w:spacing w:after="0" w:line="240" w:lineRule="auto"/>
+    </w:pPr>
+    <w:tblPr>
+      <w:tblStyleRowBandSize w:val="1"/>
+      <w:tblStyleColBandSize w:val="1"/>
+      <w:tblBorders>
+        <w:top w:val="single" w:sz="4" w:space="0" w:color="FFFFFF" w:themeColor="background1"/>
+        <w:left w:val="single" w:sz="4" w:space="0" w:color="FFFFFF" w:themeColor="background1"/>
+        <w:bottom w:val="single" w:sz="4" w:space="0" w:color="FFFFFF" w:themeColor="background1"/>
+        <w:right w:val="single" w:sz="4" w:space="0" w:color="FFFFFF" w:themeColor="background1"/>
+        <w:insideH w:val="single" w:sz="4" w:space="0" w:color="FFFFFF" w:themeColor="background1"/>
+        <w:insideV w:val="single" w:sz="4" w:space="0" w:color="FFFFFF" w:themeColor="background1"/>
+      </w:tblBorders>
+    </w:tblPr>
+    <w:tcPr>
+      <w:shd w:val="clear" w:color="auto" w:fill="C1F0C7" w:themeFill="accent3" w:themeFillTint="33"/>
+    </w:tcPr>
+    <w:tblStylePr w:type="firstRow">
+      <w:rPr>
+        <w:b/>
+        <w:bCs/>
+        <w:color w:val="FFFFFF" w:themeColor="background1"/>
+      </w:rPr>
+      <w:tblPr/>
+      <w:tcPr>
+        <w:tcBorders>
+          <w:top w:val="single" w:sz="4" w:space="0" w:color="FFFFFF" w:themeColor="background1"/>
+          <w:left w:val="single" w:sz="4" w:space="0" w:color="FFFFFF" w:themeColor="background1"/>
+          <w:right w:val="single" w:sz="4" w:space="0" w:color="FFFFFF" w:themeColor="background1"/>
+          <w:insideH w:val="nil"/>
+          <w:insideV w:val="nil"/>
+        </w:tcBorders>
+        <w:shd w:val="clear" w:color="auto" w:fill="196B24" w:themeFill="accent3"/>
+      </w:tcPr>
+    </w:tblStylePr>
+    <w:tblStylePr w:type="lastRow">
+      <w:rPr>
+        <w:b/>
+        <w:bCs/>
+        <w:color w:val="FFFFFF" w:themeColor="background1"/>
+      </w:rPr>
+      <w:tblPr/>
+      <w:tcPr>
+        <w:tcBorders>
+          <w:left w:val="single" w:sz="4" w:space="0" w:color="FFFFFF" w:themeColor="background1"/>
+          <w:bottom w:val="single" w:sz="4" w:space="0" w:color="FFFFFF" w:themeColor="background1"/>
+          <w:right w:val="single" w:sz="4" w:space="0" w:color="FFFFFF" w:themeColor="background1"/>
+          <w:insideH w:val="nil"/>
+          <w:insideV w:val="nil"/>
+        </w:tcBorders>
+        <w:shd w:val="clear" w:color="auto" w:fill="196B24" w:themeFill="accent3"/>
+      </w:tcPr>
+    </w:tblStylePr>
+    <w:tblStylePr w:type="firstCol">
+      <w:rPr>
+        <w:b/>
+        <w:bCs/>
+        <w:color w:val="FFFFFF" w:themeColor="background1"/>
+      </w:rPr>
+      <w:tblPr/>
+      <w:tcPr>
+        <w:tcBorders>
+          <w:top w:val="single" w:sz="4" w:space="0" w:color="FFFFFF" w:themeColor="background1"/>
+          <w:left w:val="single" w:sz="4" w:space="0" w:color="FFFFFF" w:themeColor="background1"/>
+          <w:bottom w:val="single" w:sz="4" w:space="0" w:color="FFFFFF" w:themeColor="background1"/>
+          <w:insideV w:val="nil"/>
+        </w:tcBorders>
+        <w:shd w:val="clear" w:color="auto" w:fill="196B24" w:themeFill="accent3"/>
+      </w:tcPr>
+    </w:tblStylePr>
+    <w:tblStylePr w:type="lastCol">
+      <w:rPr>
+        <w:b/>
+        <w:bCs/>
+        <w:color w:val="FFFFFF" w:themeColor="background1"/>
+      </w:rPr>
+      <w:tblPr/>
+      <w:tcPr>
+        <w:tcBorders>
+          <w:top w:val="single" w:sz="4" w:space="0" w:color="FFFFFF" w:themeColor="background1"/>
+          <w:bottom w:val="single" w:sz="4" w:space="0" w:color="FFFFFF" w:themeColor="background1"/>
+          <w:right w:val="single" w:sz="4" w:space="0" w:color="FFFFFF" w:themeColor="background1"/>
+          <w:insideV w:val="nil"/>
+        </w:tcBorders>
+        <w:shd w:val="clear" w:color="auto" w:fill="196B24" w:themeFill="accent3"/>
+      </w:tcPr>
+    </w:tblStylePr>
+    <w:tblStylePr w:type="band1Vert">
+      <w:tblPr/>
+      <w:tcPr>
+        <w:shd w:val="clear" w:color="auto" w:fill="84E290" w:themeFill="accent3" w:themeFillTint="66"/>
+      </w:tcPr>
+    </w:tblStylePr>
+    <w:tblStylePr w:type="band1Horz">
+      <w:tblPr/>
+      <w:tcPr>
+        <w:shd w:val="clear" w:color="auto" w:fill="84E290" w:themeFill="accent3" w:themeFillTint="66"/>
+      </w:tcPr>
+    </w:tblStylePr>
   </w:style>
 </w:styles>
 </file>

</xml_diff>